<commit_message>
v0.4.9.2: wiki + reference pages, Mill merge, Cipher Chamber
</commit_message>
<xml_diff>
--- a/Combatv3/Rules.docx
+++ b/Combatv3/Rules.docx
@@ -22353,23 +22353,7 @@
           <w:b w:val="0"/>
           <w:i w:val="0"/>
         </w:rPr>
-        <w:t xml:space="preserve">At the beginning of Bandit Mechanic Phase: </w:t>
-      </w:r>
-      <w:r>
-        <w:rPr>
-          <w:rFonts w:ascii="EB Garamond" w:hAnsi="EB Garamond"/>
-          <w:b/>
-          <w:i w:val="0"/>
-        </w:rPr>
-        <w:t>fate roll</w:t>
-      </w:r>
-      <w:r>
-        <w:rPr>
-          <w:rFonts w:ascii="EB Garamond" w:hAnsi="EB Garamond"/>
-          <w:b w:val="0"/>
-          <w:i w:val="0"/>
-        </w:rPr>
-        <w:t xml:space="preserve">. Modify by −1 for each </w:t>
+        <w:t xml:space="preserve">At the beginning of Bandit Mechanic Phase in Spring: Place a </w:t>
       </w:r>
       <w:r>
         <w:rPr>
@@ -22385,39 +22369,7 @@
           <w:b w:val="0"/>
           <w:i w:val="0"/>
         </w:rPr>
-        <w:t xml:space="preserve"> already in the </w:t>
-      </w:r>
-      <w:r>
-        <w:rPr>
-          <w:rFonts w:ascii="EB Garamond" w:hAnsi="EB Garamond"/>
-          <w:b/>
-          <w:i w:val="0"/>
-        </w:rPr>
-        <w:t>Realm</w:t>
-      </w:r>
-      <w:r>
-        <w:rPr>
-          <w:rFonts w:ascii="EB Garamond" w:hAnsi="EB Garamond"/>
-          <w:b w:val="0"/>
-          <w:i w:val="0"/>
-        </w:rPr>
-        <w:t xml:space="preserve">. If the modified roll is 7 or higher, place a </w:t>
-      </w:r>
-      <w:r>
-        <w:rPr>
-          <w:rFonts w:ascii="EB Garamond" w:hAnsi="EB Garamond"/>
-          <w:b/>
-          <w:i w:val="0"/>
-        </w:rPr>
-        <w:t>bandit camp</w:t>
-      </w:r>
-      <w:r>
-        <w:rPr>
-          <w:rFonts w:ascii="EB Garamond" w:hAnsi="EB Garamond"/>
-          <w:b w:val="0"/>
-          <w:i w:val="0"/>
-        </w:rPr>
-        <w:t xml:space="preserve"> with 10 Bandits (Retinues) in a </w:t>
+        <w:t xml:space="preserve"> with 5 Bandits (retinues) in each </w:t>
       </w:r>
       <w:r>
         <w:rPr>
@@ -22433,151 +22385,7 @@
           <w:b w:val="0"/>
           <w:i w:val="0"/>
         </w:rPr>
-        <w:t xml:space="preserve"> Outlaw Country with the fewest </w:t>
-      </w:r>
-      <w:r>
-        <w:rPr>
-          <w:rFonts w:ascii="EB Garamond" w:hAnsi="EB Garamond"/>
-          <w:b/>
-          <w:i w:val="0"/>
-        </w:rPr>
-        <w:t>bandit camps</w:t>
-      </w:r>
-      <w:r>
-        <w:rPr>
-          <w:rFonts w:ascii="EB Garamond" w:hAnsi="EB Garamond"/>
-          <w:b w:val="0"/>
-          <w:i w:val="0"/>
-        </w:rPr>
-        <w:t xml:space="preserve"> in their Outlaw Country. The </w:t>
-      </w:r>
-      <w:r>
-        <w:rPr>
-          <w:rFonts w:ascii="EB Garamond" w:hAnsi="EB Garamond"/>
-          <w:b/>
-          <w:i w:val="0"/>
-        </w:rPr>
-        <w:t>player</w:t>
-      </w:r>
-      <w:r>
-        <w:rPr>
-          <w:rFonts w:ascii="EB Garamond" w:hAnsi="EB Garamond"/>
-          <w:b w:val="0"/>
-          <w:i w:val="0"/>
-        </w:rPr>
-        <w:t xml:space="preserve"> with the highest Cunning Player besides the Player who </w:t>
-      </w:r>
-      <w:r>
-        <w:rPr>
-          <w:rFonts w:ascii="EB Garamond" w:hAnsi="EB Garamond"/>
-          <w:b/>
-          <w:i w:val="0"/>
-        </w:rPr>
-        <w:t>controls</w:t>
-      </w:r>
-      <w:r>
-        <w:rPr>
-          <w:rFonts w:ascii="EB Garamond" w:hAnsi="EB Garamond"/>
-          <w:b w:val="0"/>
-          <w:i w:val="0"/>
-        </w:rPr>
-        <w:t xml:space="preserve"> the </w:t>
-      </w:r>
-      <w:r>
-        <w:rPr>
-          <w:rFonts w:ascii="EB Garamond" w:hAnsi="EB Garamond"/>
-          <w:b/>
-          <w:i w:val="0"/>
-        </w:rPr>
-        <w:t>starting settlement region</w:t>
-      </w:r>
-      <w:r>
-        <w:rPr>
-          <w:rFonts w:ascii="EB Garamond" w:hAnsi="EB Garamond"/>
-          <w:b w:val="0"/>
-          <w:i w:val="0"/>
-        </w:rPr>
-        <w:t xml:space="preserve"> where the </w:t>
-      </w:r>
-      <w:r>
-        <w:rPr>
-          <w:rFonts w:ascii="EB Garamond" w:hAnsi="EB Garamond"/>
-          <w:b/>
-          <w:i w:val="0"/>
-        </w:rPr>
-        <w:t>bandit camp</w:t>
-      </w:r>
-      <w:r>
-        <w:rPr>
-          <w:rFonts w:ascii="EB Garamond" w:hAnsi="EB Garamond"/>
-          <w:b w:val="0"/>
-          <w:i w:val="0"/>
-        </w:rPr>
-        <w:t xml:space="preserve"> is being placed, places it. If every </w:t>
-      </w:r>
-      <w:r>
-        <w:rPr>
-          <w:rFonts w:ascii="EB Garamond" w:hAnsi="EB Garamond"/>
-          <w:b/>
-          <w:i w:val="0"/>
-        </w:rPr>
-        <w:t>player</w:t>
-      </w:r>
-      <w:r>
-        <w:rPr>
-          <w:rFonts w:ascii="EB Garamond" w:hAnsi="EB Garamond"/>
-          <w:b w:val="0"/>
-          <w:i w:val="0"/>
-        </w:rPr>
-        <w:t xml:space="preserve"> already has the same number of </w:t>
-      </w:r>
-      <w:r>
-        <w:rPr>
-          <w:rFonts w:ascii="EB Garamond" w:hAnsi="EB Garamond"/>
-          <w:b/>
-          <w:i w:val="0"/>
-        </w:rPr>
-        <w:t>bandit camps</w:t>
-      </w:r>
-      <w:r>
-        <w:rPr>
-          <w:rFonts w:ascii="EB Garamond" w:hAnsi="EB Garamond"/>
-          <w:b w:val="0"/>
-          <w:i w:val="0"/>
-        </w:rPr>
-        <w:t xml:space="preserve">, the </w:t>
-      </w:r>
-      <w:r>
-        <w:rPr>
-          <w:rFonts w:ascii="EB Garamond" w:hAnsi="EB Garamond"/>
-          <w:b/>
-          <w:i w:val="0"/>
-        </w:rPr>
-        <w:t>player</w:t>
-      </w:r>
-      <w:r>
-        <w:rPr>
-          <w:rFonts w:ascii="EB Garamond" w:hAnsi="EB Garamond"/>
-          <w:b w:val="0"/>
-          <w:i w:val="0"/>
-        </w:rPr>
-        <w:t xml:space="preserve"> with the lowest Cunning (tiebreak: Prowess) and count of </w:t>
-      </w:r>
-      <w:r>
-        <w:rPr>
-          <w:rFonts w:ascii="EB Garamond" w:hAnsi="EB Garamond"/>
-          <w:b/>
-          <w:i w:val="0"/>
-        </w:rPr>
-        <w:t>bandit camps</w:t>
-      </w:r>
-      <w:r>
-        <w:rPr>
-          <w:rFonts w:ascii="EB Garamond" w:hAnsi="EB Garamond"/>
-          <w:b w:val="0"/>
-          <w:i w:val="0"/>
-        </w:rPr>
-        <w:t xml:space="preserve"> receives the next one.</w:t>
+        <w:t xml:space="preserve"> Outlaw Country.</w:t>
       </w:r>
     </w:p>
     <w:p>
@@ -22644,7 +22452,7 @@
           <w:b w:val="0"/>
           <w:i w:val="0"/>
         </w:rPr>
-        <w:t xml:space="preserve"> when it reaches 25 Retinues. Bandit Armies still gain Retinues (max 50).</w:t>
+        <w:t xml:space="preserve"> when it reaches 25 Retinues.</w:t>
       </w:r>
     </w:p>
     <w:p>
@@ -22724,15 +22532,15 @@
           <w:b/>
           <w:i w:val="0"/>
         </w:rPr>
-        <w:t>Bandit domain</w:t>
-      </w:r>
-      <w:r>
-        <w:rPr>
-          <w:rFonts w:ascii="EB Garamond" w:hAnsi="EB Garamond"/>
-          <w:b w:val="0"/>
-          <w:i w:val="0"/>
-        </w:rPr>
-        <w:t xml:space="preserve"> Value is determined by the size of it’s Bandit Camp:</w:t>
+        <w:t>Bandit Domain</w:t>
+      </w:r>
+      <w:r>
+        <w:rPr>
+          <w:rFonts w:ascii="EB Garamond" w:hAnsi="EB Garamond"/>
+          <w:b w:val="0"/>
+          <w:i w:val="0"/>
+        </w:rPr>
+        <w:t xml:space="preserve"> value is determined by the size of it’s Bandit Camp:</w:t>
       </w:r>
     </w:p>
     <w:p>
@@ -22829,7 +22637,7 @@
           <w:b w:val="0"/>
           <w:i w:val="0"/>
         </w:rPr>
-        <w:t>If 15+ Bandits (Retinues) in camp, roll d3 each turn:</w:t>
+        <w:t>If 10+ Bandits (Retinues) in camp, roll d3 each turn:</w:t>
       </w:r>
     </w:p>
     <w:p>
@@ -22902,54 +22710,6 @@
           <w:b/>
           <w:i w:val="0"/>
         </w:rPr>
-        <w:t>Host</w:t>
-      </w:r>
-      <w:r>
-        <w:rPr>
-          <w:rFonts w:ascii="EB Garamond" w:hAnsi="EB Garamond"/>
-          <w:b w:val="0"/>
-          <w:i w:val="0"/>
-        </w:rPr>
-        <w:t xml:space="preserve"> rolls first for </w:t>
-      </w:r>
-      <w:r>
-        <w:rPr>
-          <w:rFonts w:ascii="EB Garamond" w:hAnsi="EB Garamond"/>
-          <w:b/>
-          <w:i w:val="0"/>
-        </w:rPr>
-        <w:t>spawning</w:t>
-      </w:r>
-      <w:r>
-        <w:rPr>
-          <w:rFonts w:ascii="EB Garamond" w:hAnsi="EB Garamond"/>
-          <w:b w:val="0"/>
-          <w:i w:val="0"/>
-        </w:rPr>
-        <w:t xml:space="preserve"> new </w:t>
-      </w:r>
-      <w:r>
-        <w:rPr>
-          <w:rFonts w:ascii="EB Garamond" w:hAnsi="EB Garamond"/>
-          <w:b/>
-          <w:i w:val="0"/>
-        </w:rPr>
-        <w:t>bandit camps</w:t>
-      </w:r>
-      <w:r>
-        <w:rPr>
-          <w:rFonts w:ascii="EB Garamond" w:hAnsi="EB Garamond"/>
-          <w:b w:val="0"/>
-          <w:i w:val="0"/>
-        </w:rPr>
-        <w:t xml:space="preserve">. </w:t>
-      </w:r>
-      <w:r>
-        <w:rPr>
-          <w:rFonts w:ascii="EB Garamond" w:hAnsi="EB Garamond"/>
-          <w:b/>
-          <w:i w:val="0"/>
-        </w:rPr>
         <w:t>Bandit camps</w:t>
       </w:r>
       <w:r>
@@ -22990,7 +22750,7 @@
           <w:b w:val="0"/>
           <w:i w:val="0"/>
         </w:rPr>
-        <w:t xml:space="preserve"> or </w:t>
+        <w:t xml:space="preserve">, </w:t>
       </w:r>
       <w:r>
         <w:rPr>
@@ -22999,6 +22759,22 @@
           <w:i w:val="0"/>
         </w:rPr>
         <w:t>upkeep</w:t>
+      </w:r>
+      <w:r>
+        <w:rPr>
+          <w:rFonts w:ascii="EB Garamond" w:hAnsi="EB Garamond"/>
+          <w:b w:val="0"/>
+          <w:i w:val="0"/>
+        </w:rPr>
+        <w:t xml:space="preserve">, or </w:t>
+      </w:r>
+      <w:r>
+        <w:rPr>
+          <w:rFonts w:ascii="EB Garamond" w:hAnsi="EB Garamond"/>
+          <w:b/>
+          <w:i w:val="0"/>
+        </w:rPr>
+        <w:t>recoups</w:t>
       </w:r>
       <w:r>
         <w:rPr>
@@ -23321,22 +23097,6 @@
           <w:b w:val="0"/>
           <w:i w:val="0"/>
         </w:rPr>
-        <w:t xml:space="preserve"> a</w:t>
-      </w:r>
-      <w:r>
-        <w:rPr>
-          <w:rFonts w:ascii="EB Garamond" w:hAnsi="EB Garamond"/>
-          <w:b/>
-          <w:i w:val="0"/>
-        </w:rPr>
-        <w:t>rmy</w:t>
-      </w:r>
-      <w:r>
-        <w:rPr>
-          <w:rFonts w:ascii="EB Garamond" w:hAnsi="EB Garamond"/>
-          <w:b w:val="0"/>
-          <w:i w:val="0"/>
-        </w:rPr>
         <w:t xml:space="preserve"> </w:t>
       </w:r>
       <w:r>
@@ -23345,6 +23105,22 @@
           <w:b/>
           <w:i w:val="0"/>
         </w:rPr>
+        <w:t>army</w:t>
+      </w:r>
+      <w:r>
+        <w:rPr>
+          <w:rFonts w:ascii="EB Garamond" w:hAnsi="EB Garamond"/>
+          <w:b w:val="0"/>
+          <w:i w:val="0"/>
+        </w:rPr>
+        <w:t xml:space="preserve"> </w:t>
+      </w:r>
+      <w:r>
+        <w:rPr>
+          <w:rFonts w:ascii="EB Garamond" w:hAnsi="EB Garamond"/>
+          <w:b/>
+          <w:i w:val="0"/>
+        </w:rPr>
         <w:t>action</w:t>
       </w:r>
       <w:r>
@@ -23513,15 +23289,15 @@
           <w:b w:val="0"/>
           <w:i w:val="0"/>
         </w:rPr>
-        <w:t xml:space="preserve"> g</w:t>
-      </w:r>
-      <w:r>
-        <w:rPr>
-          <w:rFonts w:ascii="EB Garamond" w:hAnsi="EB Garamond"/>
-          <w:b/>
-          <w:i w:val="0"/>
-        </w:rPr>
-        <w:t>old</w:t>
+        <w:t xml:space="preserve"> </w:t>
+      </w:r>
+      <w:r>
+        <w:rPr>
+          <w:rFonts w:ascii="EB Garamond" w:hAnsi="EB Garamond"/>
+          <w:b/>
+          <w:i w:val="0"/>
+        </w:rPr>
+        <w:t>gold</w:t>
       </w:r>
       <w:r>
         <w:rPr>

</xml_diff>

<commit_message>
v0.4.9.2.7: wiki + reference pages, Mill merge, Cipher Chamber
</commit_message>
<xml_diff>
--- a/Combatv3/Rules.docx
+++ b/Combatv3/Rules.docx
@@ -18749,9 +18749,9 @@
         <w:tblLook w:val="04A0" w:firstRow="1" w:lastRow="0" w:firstColumn="1" w:lastColumn="0" w:noHBand="0" w:noVBand="1"/>
       </w:tblPr>
       <w:tblGrid>
-        <w:gridCol w:w="1408"/>
-        <w:gridCol w:w="6058"/>
-        <w:gridCol w:w="3000"/>
+        <w:gridCol w:w="1410"/>
+        <w:gridCol w:w="6032"/>
+        <w:gridCol w:w="3024"/>
       </w:tblGrid>
       <w:tr>
         <w:trPr>
@@ -18759,7 +18759,7 @@
         </w:trPr>
         <w:tc>
           <w:tcPr>
-            <w:tcW w:w="1408" w:type="dxa"/>
+            <w:tcW w:w="1410" w:type="dxa"/>
           </w:tcPr>
           <w:p>
             <w:pPr>
@@ -18783,7 +18783,7 @@
         </w:tc>
         <w:tc>
           <w:tcPr>
-            <w:tcW w:w="6058" w:type="dxa"/>
+            <w:tcW w:w="6032" w:type="dxa"/>
           </w:tcPr>
           <w:p>
             <w:pPr>
@@ -18807,7 +18807,7 @@
         </w:tc>
         <w:tc>
           <w:tcPr>
-            <w:tcW w:w="3000" w:type="dxa"/>
+            <w:tcW w:w="3024" w:type="dxa"/>
           </w:tcPr>
           <w:p>
             <w:pPr>
@@ -18833,7 +18833,7 @@
       <w:tr>
         <w:tc>
           <w:tcPr>
-            <w:tcW w:w="1408" w:type="dxa"/>
+            <w:tcW w:w="1410" w:type="dxa"/>
           </w:tcPr>
           <w:p>
             <w:pPr>
@@ -18855,7 +18855,7 @@
         </w:tc>
         <w:tc>
           <w:tcPr>
-            <w:tcW w:w="6058" w:type="dxa"/>
+            <w:tcW w:w="6032" w:type="dxa"/>
           </w:tcPr>
           <w:p>
             <w:pPr>
@@ -18877,7 +18877,7 @@
         </w:tc>
         <w:tc>
           <w:tcPr>
-            <w:tcW w:w="3000" w:type="dxa"/>
+            <w:tcW w:w="3024" w:type="dxa"/>
           </w:tcPr>
           <w:p>
             <w:pPr>
@@ -18901,7 +18901,7 @@
       <w:tr>
         <w:tc>
           <w:tcPr>
-            <w:tcW w:w="1408" w:type="dxa"/>
+            <w:tcW w:w="1410" w:type="dxa"/>
           </w:tcPr>
           <w:p>
             <w:pPr>
@@ -18923,7 +18923,7 @@
         </w:tc>
         <w:tc>
           <w:tcPr>
-            <w:tcW w:w="6058" w:type="dxa"/>
+            <w:tcW w:w="6032" w:type="dxa"/>
           </w:tcPr>
           <w:p>
             <w:pPr>
@@ -18945,7 +18945,7 @@
         </w:tc>
         <w:tc>
           <w:tcPr>
-            <w:tcW w:w="3000" w:type="dxa"/>
+            <w:tcW w:w="3024" w:type="dxa"/>
           </w:tcPr>
           <w:p>
             <w:pPr>
@@ -18969,7 +18969,7 @@
       <w:tr>
         <w:tc>
           <w:tcPr>
-            <w:tcW w:w="1408" w:type="dxa"/>
+            <w:tcW w:w="1410" w:type="dxa"/>
           </w:tcPr>
           <w:p>
             <w:pPr>
@@ -18991,7 +18991,7 @@
         </w:tc>
         <w:tc>
           <w:tcPr>
-            <w:tcW w:w="6058" w:type="dxa"/>
+            <w:tcW w:w="6032" w:type="dxa"/>
           </w:tcPr>
           <w:p>
             <w:pPr>
@@ -19013,7 +19013,7 @@
         </w:tc>
         <w:tc>
           <w:tcPr>
-            <w:tcW w:w="3000" w:type="dxa"/>
+            <w:tcW w:w="3024" w:type="dxa"/>
           </w:tcPr>
           <w:p>
             <w:pPr>
@@ -19037,7 +19037,7 @@
       <w:tr>
         <w:tc>
           <w:tcPr>
-            <w:tcW w:w="1408" w:type="dxa"/>
+            <w:tcW w:w="1410" w:type="dxa"/>
           </w:tcPr>
           <w:p>
             <w:pPr>
@@ -19059,7 +19059,7 @@
         </w:tc>
         <w:tc>
           <w:tcPr>
-            <w:tcW w:w="6058" w:type="dxa"/>
+            <w:tcW w:w="6032" w:type="dxa"/>
           </w:tcPr>
           <w:p>
             <w:pPr>
@@ -19081,7 +19081,7 @@
         </w:tc>
         <w:tc>
           <w:tcPr>
-            <w:tcW w:w="3000" w:type="dxa"/>
+            <w:tcW w:w="3024" w:type="dxa"/>
           </w:tcPr>
           <w:p>
             <w:pPr>
@@ -19105,7 +19105,7 @@
       <w:tr>
         <w:tc>
           <w:tcPr>
-            <w:tcW w:w="1408" w:type="dxa"/>
+            <w:tcW w:w="1410" w:type="dxa"/>
           </w:tcPr>
           <w:p>
             <w:pPr>
@@ -19127,7 +19127,7 @@
         </w:tc>
         <w:tc>
           <w:tcPr>
-            <w:tcW w:w="6058" w:type="dxa"/>
+            <w:tcW w:w="6032" w:type="dxa"/>
           </w:tcPr>
           <w:p>
             <w:pPr>
@@ -19143,13 +19143,13 @@
                 <w:sz w:val="17"/>
                 <w:szCs w:val="17"/>
               </w:rPr>
-              <w:t xml:space="preserve">Must end Move after passing over 1 Water Territory (must end on land)</w:t>
+              <w:t xml:space="preserve">Must end move after passing over 1 Water Territory (must end on land)</w:t>
             </w:r>
           </w:p>
         </w:tc>
         <w:tc>
           <w:tcPr>
-            <w:tcW w:w="3000" w:type="dxa"/>
+            <w:tcW w:w="3024" w:type="dxa"/>
           </w:tcPr>
           <w:p>
             <w:pPr>
@@ -19173,7 +19173,7 @@
       <w:tr>
         <w:tc>
           <w:tcPr>
-            <w:tcW w:w="1408" w:type="dxa"/>
+            <w:tcW w:w="1410" w:type="dxa"/>
           </w:tcPr>
           <w:p>
             <w:pPr>
@@ -19195,7 +19195,7 @@
         </w:tc>
         <w:tc>
           <w:tcPr>
-            <w:tcW w:w="6058" w:type="dxa"/>
+            <w:tcW w:w="6032" w:type="dxa"/>
           </w:tcPr>
           <w:p>
             <w:pPr>
@@ -19217,7 +19217,7 @@
         </w:tc>
         <w:tc>
           <w:tcPr>
-            <w:tcW w:w="3000" w:type="dxa"/>
+            <w:tcW w:w="3024" w:type="dxa"/>
           </w:tcPr>
           <w:p>
             <w:pPr>
@@ -19234,6 +19234,74 @@
                 <w:szCs w:val="17"/>
               </w:rPr>
               <w:t xml:space="preserve">Forestry, Apiary</w:t>
+            </w:r>
+          </w:p>
+        </w:tc>
+      </w:tr>
+      <w:tr>
+        <w:tc>
+          <w:tcPr>
+            <w:tcW w:w="1410" w:type="dxa"/>
+          </w:tcPr>
+          <w:p>
+            <w:pPr>
+              <w:spacing w:before="0" w:after="0"/>
+              <w:rPr>
+                <w:rFonts w:ascii="EB Garamond" w:hAnsi="EB Garamond"/>
+                <w:sz w:val="17"/>
+              </w:rPr>
+            </w:pPr>
+            <w:r>
+              <w:rPr>
+                <w:rFonts w:ascii="EB Garamond" w:hAnsi="EB Garamond" w:cs="EB Garamond"/>
+                <w:sz w:val="17"/>
+                <w:szCs w:val="17"/>
+              </w:rPr>
+              <w:t xml:space="preserve">Hill</w:t>
+            </w:r>
+          </w:p>
+        </w:tc>
+        <w:tc>
+          <w:tcPr>
+            <w:tcW w:w="6032" w:type="dxa"/>
+          </w:tcPr>
+          <w:p>
+            <w:pPr>
+              <w:spacing w:before="0" w:after="0"/>
+              <w:rPr>
+                <w:rFonts w:ascii="EB Garamond" w:hAnsi="EB Garamond"/>
+                <w:sz w:val="17"/>
+              </w:rPr>
+            </w:pPr>
+            <w:r>
+              <w:rPr>
+                <w:rFonts w:ascii="EB Garamond" w:hAnsi="EB Garamond" w:cs="EB Garamond"/>
+                <w:sz w:val="17"/>
+                <w:szCs w:val="17"/>
+              </w:rPr>
+              <w:t xml:space="preserve">Gains Seize the Initiative. Where Settlements can be chartered.</w:t>
+            </w:r>
+          </w:p>
+        </w:tc>
+        <w:tc>
+          <w:tcPr>
+            <w:tcW w:w="3024" w:type="dxa"/>
+          </w:tcPr>
+          <w:p>
+            <w:pPr>
+              <w:spacing w:before="0" w:after="0"/>
+              <w:rPr>
+                <w:rFonts w:ascii="EB Garamond" w:hAnsi="EB Garamond"/>
+                <w:sz w:val="17"/>
+              </w:rPr>
+            </w:pPr>
+            <w:r>
+              <w:rPr>
+                <w:rFonts w:ascii="EB Garamond" w:hAnsi="EB Garamond" w:cs="EB Garamond"/>
+                <w:sz w:val="17"/>
+                <w:szCs w:val="17"/>
+              </w:rPr>
+              <w:t xml:space="preserve">—</w:t>
             </w:r>
           </w:p>
         </w:tc>
@@ -26749,6 +26817,52 @@
                 <w:sz w:val="17"/>
                 <w:szCs w:val="17"/>
               </w:rPr>
+              <w:t xml:space="preserve">2</w:t>
+            </w:r>
+          </w:p>
+        </w:tc>
+      </w:tr>
+      <w:tr>
+        <w:tc>
+          <w:tcPr>
+            <w:tcW w:w="1689" w:type="dxa"/>
+          </w:tcPr>
+          <w:p>
+            <w:pPr>
+              <w:spacing w:before="0" w:after="0"/>
+              <w:rPr>
+                <w:rFonts w:ascii="EB Garamond" w:hAnsi="EB Garamond"/>
+                <w:sz w:val="17"/>
+              </w:rPr>
+            </w:pPr>
+            <w:r>
+              <w:rPr>
+                <w:rFonts w:ascii="EB Garamond" w:hAnsi="EB Garamond" w:cs="EB Garamond"/>
+                <w:sz w:val="17"/>
+                <w:szCs w:val="17"/>
+              </w:rPr>
+              <w:t xml:space="preserve">Eminence</w:t>
+            </w:r>
+          </w:p>
+        </w:tc>
+        <w:tc>
+          <w:tcPr>
+            <w:tcW w:w="8777" w:type="dxa"/>
+          </w:tcPr>
+          <w:p>
+            <w:pPr>
+              <w:spacing w:before="0" w:after="0"/>
+              <w:rPr>
+                <w:rFonts w:ascii="EB Garamond" w:hAnsi="EB Garamond"/>
+                <w:sz w:val="17"/>
+              </w:rPr>
+            </w:pPr>
+            <w:r>
+              <w:rPr>
+                <w:rFonts w:ascii="EB Garamond" w:hAnsi="EB Garamond" w:cs="EB Garamond"/>
+                <w:sz w:val="17"/>
+                <w:szCs w:val="17"/>
+              </w:rPr>
               <w:t xml:space="preserve">5</w:t>
             </w:r>
           </w:p>
@@ -26773,52 +26887,6 @@
                 <w:sz w:val="17"/>
                 <w:szCs w:val="17"/>
               </w:rPr>
-              <w:t xml:space="preserve">Eminence</w:t>
-            </w:r>
-          </w:p>
-        </w:tc>
-        <w:tc>
-          <w:tcPr>
-            <w:tcW w:w="8777" w:type="dxa"/>
-          </w:tcPr>
-          <w:p>
-            <w:pPr>
-              <w:spacing w:before="0" w:after="0"/>
-              <w:rPr>
-                <w:rFonts w:ascii="EB Garamond" w:hAnsi="EB Garamond"/>
-                <w:sz w:val="17"/>
-              </w:rPr>
-            </w:pPr>
-            <w:r>
-              <w:rPr>
-                <w:rFonts w:ascii="EB Garamond" w:hAnsi="EB Garamond" w:cs="EB Garamond"/>
-                <w:sz w:val="17"/>
-                <w:szCs w:val="17"/>
-              </w:rPr>
-              <w:t xml:space="preserve">10</w:t>
-            </w:r>
-          </w:p>
-        </w:tc>
-      </w:tr>
-      <w:tr>
-        <w:tc>
-          <w:tcPr>
-            <w:tcW w:w="1689" w:type="dxa"/>
-          </w:tcPr>
-          <w:p>
-            <w:pPr>
-              <w:spacing w:before="0" w:after="0"/>
-              <w:rPr>
-                <w:rFonts w:ascii="EB Garamond" w:hAnsi="EB Garamond"/>
-                <w:sz w:val="17"/>
-              </w:rPr>
-            </w:pPr>
-            <w:r>
-              <w:rPr>
-                <w:rFonts w:ascii="EB Garamond" w:hAnsi="EB Garamond" w:cs="EB Garamond"/>
-                <w:sz w:val="17"/>
-                <w:szCs w:val="17"/>
-              </w:rPr>
               <w:t xml:space="preserve">Zenith</w:t>
             </w:r>
           </w:p>
@@ -26841,7 +26909,7 @@
                 <w:sz w:val="17"/>
                 <w:szCs w:val="17"/>
               </w:rPr>
-              <w:t xml:space="preserve">20</w:t>
+              <w:t xml:space="preserve">10</w:t>
             </w:r>
           </w:p>
         </w:tc>

</xml_diff>

<commit_message>
v0.4.9.3: wiki + reference pages, Mill merge, Cipher Chamber
</commit_message>
<xml_diff>
--- a/Combatv3/Rules.docx
+++ b/Combatv3/Rules.docx
@@ -10302,7 +10302,7 @@
                 <w:sz w:val="17"/>
                 <w:szCs w:val="17"/>
               </w:rPr>
-              <w:t xml:space="preserve">Edict of War: All armies gain Parry. Gain Immune State of Alarm (No longer gain Doubt while at War).</w:t>
+              <w:t xml:space="preserve">Edict of War: All armies gain Parry. Gain Immune State of Alarm (No longer gain Doubt while at War). Parry</w:t>
             </w:r>
           </w:p>
         </w:tc>
@@ -10414,7 +10414,7 @@
                 <w:sz w:val="17"/>
                 <w:szCs w:val="17"/>
               </w:rPr>
-              <w:t xml:space="preserve">Grand Vizier: Players may not target you with Cunning Envoys if your Cunning value is higher. When you perform a Skirmish action, your opponent gains Blunder in the first Skirmish of that Battle.</w:t>
+              <w:t xml:space="preserve">Grand Vizier: Players may not target you with Cunning Envoys if your Cunning value is higher. When you perform a Skirmish action, your opponent gains Blunder in the first Skirmish of that Battle. Foes gain Blunder in first Skirmish</w:t>
             </w:r>
           </w:p>
         </w:tc>
@@ -10436,7 +10436,7 @@
                 <w:sz w:val="17"/>
                 <w:szCs w:val="17"/>
               </w:rPr>
-              <w:t xml:space="preserve">Master Conspirator: Once per turn, if your non-Cunning Envoy passes or is Endorsed, you may instead perform a Cunning action. In Battle, your opponent gains Strained each Skirmish.</w:t>
+              <w:t xml:space="preserve">Master Conspirator: Once per turn, if your non-Cunning Envoy passes or is Endorsed, you may instead perform a Cunning action. In Battle, your opponent gains Strained each Skirmish. Foes gain Strain</w:t>
             </w:r>
           </w:p>
         </w:tc>
@@ -10526,7 +10526,7 @@
                 <w:sz w:val="17"/>
                 <w:szCs w:val="17"/>
               </w:rPr>
-              <w:t xml:space="preserve">Prophet of Retribution: All other players gain Doubt +2 while your Public Order is positive.</w:t>
+              <w:t xml:space="preserve">Prophet of Retribution: All other players gain Doubt +2 while your Public Order is positive. +1 Morale</w:t>
             </w:r>
           </w:p>
         </w:tc>

</xml_diff>

<commit_message>
v0.4.9.5: wiki + reference pages, Mill merge, Cipher Chamber
</commit_message>
<xml_diff>
--- a/Combatv3/Rules.docx
+++ b/Combatv3/Rules.docx
@@ -723,7 +723,7 @@
                 <w:sz w:val="17"/>
                 <w:szCs w:val="17"/>
               </w:rPr>
-              <w:t xml:space="preserve">Generate 10,000 gold per turn for five consecutive turns.</w:t>
+              <w:t xml:space="preserve">Generate 5,000 gold per turn for five consecutive turns.</w:t>
             </w:r>
           </w:p>
         </w:tc>
@@ -1212,28 +1212,6 @@
                 <w:sz w:val="17"/>
                 <w:szCs w:val="17"/>
               </w:rPr>
-              <w:t xml:space="preserve">0</w:t>
-            </w:r>
-          </w:p>
-        </w:tc>
-        <w:tc>
-          <w:tcPr>
-            <w:tcW w:w="1011" w:type="dxa"/>
-          </w:tcPr>
-          <w:p>
-            <w:pPr>
-              <w:spacing w:before="0" w:after="0"/>
-              <w:rPr>
-                <w:rFonts w:ascii="EB Garamond" w:hAnsi="EB Garamond"/>
-                <w:sz w:val="17"/>
-              </w:rPr>
-            </w:pPr>
-            <w:r>
-              <w:rPr>
-                <w:rFonts w:ascii="EB Garamond" w:hAnsi="EB Garamond" w:cs="EB Garamond"/>
-                <w:sz w:val="17"/>
-                <w:szCs w:val="17"/>
-              </w:rPr>
               <w:t xml:space="preserve">1</w:t>
             </w:r>
           </w:p>
@@ -1256,6 +1234,28 @@
                 <w:sz w:val="17"/>
                 <w:szCs w:val="17"/>
               </w:rPr>
+              <w:t xml:space="preserve">1</w:t>
+            </w:r>
+          </w:p>
+        </w:tc>
+        <w:tc>
+          <w:tcPr>
+            <w:tcW w:w="1011" w:type="dxa"/>
+          </w:tcPr>
+          <w:p>
+            <w:pPr>
+              <w:spacing w:before="0" w:after="0"/>
+              <w:rPr>
+                <w:rFonts w:ascii="EB Garamond" w:hAnsi="EB Garamond"/>
+                <w:sz w:val="17"/>
+              </w:rPr>
+            </w:pPr>
+            <w:r>
+              <w:rPr>
+                <w:rFonts w:ascii="EB Garamond" w:hAnsi="EB Garamond" w:cs="EB Garamond"/>
+                <w:sz w:val="17"/>
+                <w:szCs w:val="17"/>
+              </w:rPr>
               <w:t xml:space="preserve">0</w:t>
             </w:r>
           </w:p>
@@ -1300,7 +1300,7 @@
                 <w:sz w:val="17"/>
                 <w:szCs w:val="17"/>
               </w:rPr>
-              <w:t xml:space="preserve">0</w:t>
+              <w:t xml:space="preserve">1</w:t>
             </w:r>
           </w:p>
         </w:tc>
@@ -1456,7 +1456,7 @@
                 <w:sz w:val="17"/>
                 <w:szCs w:val="17"/>
               </w:rPr>
-              <w:t xml:space="preserve">1</w:t>
+              <w:t xml:space="preserve">2</w:t>
             </w:r>
           </w:p>
         </w:tc>
@@ -1612,7 +1612,7 @@
                 <w:sz w:val="17"/>
                 <w:szCs w:val="17"/>
               </w:rPr>
-              <w:t xml:space="preserve">2</w:t>
+              <w:t xml:space="preserve">3</w:t>
             </w:r>
           </w:p>
         </w:tc>
@@ -1768,7 +1768,7 @@
                 <w:sz w:val="17"/>
                 <w:szCs w:val="17"/>
               </w:rPr>
-              <w:t xml:space="preserve">3</w:t>
+              <w:t xml:space="preserve">4</w:t>
             </w:r>
           </w:p>
         </w:tc>
@@ -6782,7 +6782,7 @@
           <w:rFonts w:ascii="EB Garamond" w:hAnsi="EB Garamond"/>
           <w:sz w:val="20"/>
         </w:rPr>
-        <w:t xml:space="preserve">Move an Army up to its Speed in Territories, then choose: March (move up to 2x Speed, −1 Endurance, no other action), Skirmish (end adjacent to a non-allied Army not in a settlement → Battle, Seize the Initiative +1I Skirmish 1), Lay Siege (end adjacent to an at-war settlement → Siege), or Muster (within range 3 of your settlements, not within range 1 of a non-ally, with an active Muster Field → recruit up to combined muster limit; may swap retinues between adjacent allied armies and change equipment).</w:t>
+        <w:t xml:space="preserve">Move an Army up to its Speed in Territories, then choose: March (move up to 2x Speed, −1 Endurance, no other action), Battle (end adjacent to a non-allied Army not in a settlement → Battle, Seize the Initiative +1I Skirmish 1), Lay Siege (end adjacent to an at-war settlement → Siege), or Muster (within range 2 of your settlements, not within range 1 of a non-ally, with an active Muster Field → recruit up to combined muster limit; may swap retinues between adjacent allied armies and change equipment).</w:t>
       </w:r>
     </w:p>
     <w:p>
@@ -6869,7 +6869,7 @@
           <w:rFonts w:ascii="EB Garamond" w:hAnsi="EB Garamond"/>
           <w:sz w:val="20"/>
         </w:rPr>
-        <w:t xml:space="preserve">An Army that Skirmished/Sieged/Mustered cannot act again until that battle/siege/muster timer ends.</w:t>
+        <w:t xml:space="preserve">An Army that Battled/Sieged/Mustered cannot act again until that battle/siege/muster timer ends.</w:t>
       </w:r>
     </w:p>
     <w:p>
@@ -6888,7 +6888,7 @@
           <w:rFonts w:ascii="EB Garamond" w:hAnsi="EB Garamond"/>
           <w:sz w:val="20"/>
         </w:rPr>
-        <w:t xml:space="preserve">An Army that Skirmished gains +1I in the first Skirmish.</w:t>
+        <w:t xml:space="preserve">An Army that Battled gains Seize the Initiative in the first Skirmish.</w:t>
       </w:r>
     </w:p>
     <w:p>
@@ -8746,7 +8746,7 @@
           <w:rFonts w:ascii="EB Garamond" w:hAnsi="EB Garamond"/>
           <w:sz w:val="20"/>
         </w:rPr>
-        <w:t xml:space="preserve">Choose a damaged Pursuit or Infrastructure in a settlement you control; set Repair Timer 2. At 0, choose: Restore (reactivate with all effects) or Demolish (remove it, freeing the ward).</w:t>
+        <w:t xml:space="preserve">Choose a damaged Pursuit or Infrastructure in a settlement you control; set Build Timer 2. At 0, choose: Restore (reactivate with all effects) or Demolish (remove it, freeing the ward).</w:t>
       </w:r>
     </w:p>
     <w:p>
@@ -10302,7 +10302,7 @@
                 <w:sz w:val="17"/>
                 <w:szCs w:val="17"/>
               </w:rPr>
-              <w:t xml:space="preserve">Edict of War: All armies gain Parry. Gain Immune State of Alarm (No longer gain Doubt while at War). Parry</w:t>
+              <w:t xml:space="preserve">Edict of War: May have an additional Army. Perform a Muster Action. All armies gain Parry. Parry</w:t>
             </w:r>
           </w:p>
         </w:tc>
@@ -10324,7 +10324,7 @@
                 <w:sz w:val="17"/>
                 <w:szCs w:val="17"/>
               </w:rPr>
-              <w:t xml:space="preserve">High Quartermaster: Upkeep -2000. No longer lose Influence while at War. May change equipment on your armies during any upkeep phase where that army is within Province.</w:t>
+              <w:t xml:space="preserve">High Quartermaster: Upkeep -2000. May change equipment on your armies during any upkeep phase where that army is within Province. No longer lose Influence while at War.</w:t>
             </w:r>
           </w:p>
         </w:tc>
@@ -10392,7 +10392,7 @@
                 <w:sz w:val="17"/>
                 <w:szCs w:val="17"/>
               </w:rPr>
-              <w:t xml:space="preserve">Clandestine Councilor: Once per turn, when another player's Envoy is Sent, target a player - that player Abstains.</w:t>
+              <w:t xml:space="preserve">Clandestine Councilor: Once per Envoy, target a player - that player Abstains.</w:t>
             </w:r>
           </w:p>
         </w:tc>
@@ -10504,7 +10504,7 @@
                 <w:sz w:val="17"/>
                 <w:szCs w:val="17"/>
               </w:rPr>
-              <w:t xml:space="preserve">Divine Mandate: Faith +2.</w:t>
+              <w:t xml:space="preserve">Divine Mandate: Faith +1 each Empire Phase.</w:t>
             </w:r>
           </w:p>
         </w:tc>
@@ -10526,7 +10526,7 @@
                 <w:sz w:val="17"/>
                 <w:szCs w:val="17"/>
               </w:rPr>
-              <w:t xml:space="preserve">Prophet of Retribution: All other players gain Doubt +2 while your Public Order is positive. +1 Morale</w:t>
+              <w:t xml:space="preserve">Prophet of Retribution: Each Empire Phase, all other players gain Doubt +2 while your Public Order is positive. +1 Morale</w:t>
             </w:r>
           </w:p>
         </w:tc>
@@ -10706,28 +10706,6 @@
                 <w:sz w:val="17"/>
                 <w:szCs w:val="17"/>
               </w:rPr>
-              <w:t xml:space="preserve">0</w:t>
-            </w:r>
-          </w:p>
-        </w:tc>
-        <w:tc>
-          <w:tcPr>
-            <w:tcW w:w="2386" w:type="dxa"/>
-          </w:tcPr>
-          <w:p>
-            <w:pPr>
-              <w:spacing w:before="0" w:after="0"/>
-              <w:rPr>
-                <w:rFonts w:ascii="EB Garamond" w:hAnsi="EB Garamond"/>
-                <w:sz w:val="17"/>
-              </w:rPr>
-            </w:pPr>
-            <w:r>
-              <w:rPr>
-                <w:rFonts w:ascii="EB Garamond" w:hAnsi="EB Garamond" w:cs="EB Garamond"/>
-                <w:sz w:val="17"/>
-                <w:szCs w:val="17"/>
-              </w:rPr>
               <w:t xml:space="preserve">1</w:t>
             </w:r>
           </w:p>
@@ -10756,6 +10734,28 @@
         </w:tc>
         <w:tc>
           <w:tcPr>
+            <w:tcW w:w="2386" w:type="dxa"/>
+          </w:tcPr>
+          <w:p>
+            <w:pPr>
+              <w:spacing w:before="0" w:after="0"/>
+              <w:rPr>
+                <w:rFonts w:ascii="EB Garamond" w:hAnsi="EB Garamond"/>
+                <w:sz w:val="17"/>
+              </w:rPr>
+            </w:pPr>
+            <w:r>
+              <w:rPr>
+                <w:rFonts w:ascii="EB Garamond" w:hAnsi="EB Garamond" w:cs="EB Garamond"/>
+                <w:sz w:val="17"/>
+                <w:szCs w:val="17"/>
+              </w:rPr>
+              <w:t xml:space="preserve">3</w:t>
+            </w:r>
+          </w:p>
+        </w:tc>
+        <w:tc>
+          <w:tcPr>
             <w:tcW w:w="2518" w:type="dxa"/>
           </w:tcPr>
           <w:p>
@@ -10772,7 +10772,7 @@
                 <w:sz w:val="17"/>
                 <w:szCs w:val="17"/>
               </w:rPr>
-              <w:t xml:space="preserve">3</w:t>
+              <w:t xml:space="preserve">4</w:t>
             </w:r>
           </w:p>
         </w:tc>
@@ -12982,15 +12982,15 @@
         <w:tblLook w:val="04A0" w:firstRow="1" w:lastRow="0" w:firstColumn="1" w:lastColumn="0" w:noHBand="0" w:noVBand="1"/>
       </w:tblPr>
       <w:tblGrid>
-        <w:gridCol w:w="755"/>
-        <w:gridCol w:w="1385"/>
-        <w:gridCol w:w="965"/>
-        <w:gridCol w:w="860"/>
-        <w:gridCol w:w="965"/>
-        <w:gridCol w:w="860"/>
-        <w:gridCol w:w="860"/>
-        <w:gridCol w:w="860"/>
-        <w:gridCol w:w="2956"/>
+        <w:gridCol w:w="758"/>
+        <w:gridCol w:w="1388"/>
+        <w:gridCol w:w="976"/>
+        <w:gridCol w:w="758"/>
+        <w:gridCol w:w="968"/>
+        <w:gridCol w:w="863"/>
+        <w:gridCol w:w="863"/>
+        <w:gridCol w:w="863"/>
+        <w:gridCol w:w="3029"/>
       </w:tblGrid>
       <w:tr>
         <w:trPr>
@@ -12998,7 +12998,7 @@
         </w:trPr>
         <w:tc>
           <w:tcPr>
-            <w:tcW w:w="755" w:type="dxa"/>
+            <w:tcW w:w="758" w:type="dxa"/>
           </w:tcPr>
           <w:p>
             <w:pPr>
@@ -13022,7 +13022,7 @@
         </w:tc>
         <w:tc>
           <w:tcPr>
-            <w:tcW w:w="1385" w:type="dxa"/>
+            <w:tcW w:w="1388" w:type="dxa"/>
           </w:tcPr>
           <w:p>
             <w:pPr>
@@ -13046,7 +13046,7 @@
         </w:tc>
         <w:tc>
           <w:tcPr>
-            <w:tcW w:w="965" w:type="dxa"/>
+            <w:tcW w:w="976" w:type="dxa"/>
           </w:tcPr>
           <w:p>
             <w:pPr>
@@ -13070,7 +13070,7 @@
         </w:tc>
         <w:tc>
           <w:tcPr>
-            <w:tcW w:w="860" w:type="dxa"/>
+            <w:tcW w:w="758" w:type="dxa"/>
           </w:tcPr>
           <w:p>
             <w:pPr>
@@ -13094,7 +13094,7 @@
         </w:tc>
         <w:tc>
           <w:tcPr>
-            <w:tcW w:w="965" w:type="dxa"/>
+            <w:tcW w:w="968" w:type="dxa"/>
           </w:tcPr>
           <w:p>
             <w:pPr>
@@ -13118,7 +13118,7 @@
         </w:tc>
         <w:tc>
           <w:tcPr>
-            <w:tcW w:w="860" w:type="dxa"/>
+            <w:tcW w:w="863" w:type="dxa"/>
           </w:tcPr>
           <w:p>
             <w:pPr>
@@ -13142,7 +13142,7 @@
         </w:tc>
         <w:tc>
           <w:tcPr>
-            <w:tcW w:w="860" w:type="dxa"/>
+            <w:tcW w:w="863" w:type="dxa"/>
           </w:tcPr>
           <w:p>
             <w:pPr>
@@ -13166,7 +13166,7 @@
         </w:tc>
         <w:tc>
           <w:tcPr>
-            <w:tcW w:w="860" w:type="dxa"/>
+            <w:tcW w:w="863" w:type="dxa"/>
           </w:tcPr>
           <w:p>
             <w:pPr>
@@ -13190,7 +13190,7 @@
         </w:tc>
         <w:tc>
           <w:tcPr>
-            <w:tcW w:w="2956" w:type="dxa"/>
+            <w:tcW w:w="3029" w:type="dxa"/>
           </w:tcPr>
           <w:p>
             <w:pPr>
@@ -13216,7 +13216,7 @@
       <w:tr>
         <w:tc>
           <w:tcPr>
-            <w:tcW w:w="755" w:type="dxa"/>
+            <w:tcW w:w="758" w:type="dxa"/>
           </w:tcPr>
           <w:p>
             <w:pPr>
@@ -13238,7 +13238,7 @@
         </w:tc>
         <w:tc>
           <w:tcPr>
-            <w:tcW w:w="1385" w:type="dxa"/>
+            <w:tcW w:w="1388" w:type="dxa"/>
           </w:tcPr>
           <w:p>
             <w:pPr>
@@ -13260,7 +13260,7 @@
         </w:tc>
         <w:tc>
           <w:tcPr>
-            <w:tcW w:w="965" w:type="dxa"/>
+            <w:tcW w:w="976" w:type="dxa"/>
           </w:tcPr>
           <w:p>
             <w:pPr>
@@ -13282,7 +13282,7 @@
         </w:tc>
         <w:tc>
           <w:tcPr>
-            <w:tcW w:w="860" w:type="dxa"/>
+            <w:tcW w:w="758" w:type="dxa"/>
           </w:tcPr>
           <w:p>
             <w:pPr>
@@ -13304,7 +13304,7 @@
         </w:tc>
         <w:tc>
           <w:tcPr>
-            <w:tcW w:w="965" w:type="dxa"/>
+            <w:tcW w:w="968" w:type="dxa"/>
           </w:tcPr>
           <w:p>
             <w:pPr>
@@ -13326,7 +13326,7 @@
         </w:tc>
         <w:tc>
           <w:tcPr>
-            <w:tcW w:w="860" w:type="dxa"/>
+            <w:tcW w:w="863" w:type="dxa"/>
           </w:tcPr>
           <w:p>
             <w:pPr>
@@ -13348,7 +13348,7 @@
         </w:tc>
         <w:tc>
           <w:tcPr>
-            <w:tcW w:w="860" w:type="dxa"/>
+            <w:tcW w:w="863" w:type="dxa"/>
           </w:tcPr>
           <w:p>
             <w:pPr>
@@ -13370,7 +13370,7 @@
         </w:tc>
         <w:tc>
           <w:tcPr>
-            <w:tcW w:w="860" w:type="dxa"/>
+            <w:tcW w:w="863" w:type="dxa"/>
           </w:tcPr>
           <w:p>
             <w:pPr>
@@ -13392,7 +13392,7 @@
         </w:tc>
         <w:tc>
           <w:tcPr>
-            <w:tcW w:w="2956" w:type="dxa"/>
+            <w:tcW w:w="3029" w:type="dxa"/>
           </w:tcPr>
           <w:p>
             <w:pPr>
@@ -13416,7 +13416,7 @@
       <w:tr>
         <w:tc>
           <w:tcPr>
-            <w:tcW w:w="755" w:type="dxa"/>
+            <w:tcW w:w="758" w:type="dxa"/>
           </w:tcPr>
           <w:p>
             <w:pPr>
@@ -13438,7 +13438,7 @@
         </w:tc>
         <w:tc>
           <w:tcPr>
-            <w:tcW w:w="1385" w:type="dxa"/>
+            <w:tcW w:w="1388" w:type="dxa"/>
           </w:tcPr>
           <w:p>
             <w:pPr>
@@ -13460,7 +13460,7 @@
         </w:tc>
         <w:tc>
           <w:tcPr>
-            <w:tcW w:w="965" w:type="dxa"/>
+            <w:tcW w:w="976" w:type="dxa"/>
           </w:tcPr>
           <w:p>
             <w:pPr>
@@ -13482,7 +13482,7 @@
         </w:tc>
         <w:tc>
           <w:tcPr>
-            <w:tcW w:w="860" w:type="dxa"/>
+            <w:tcW w:w="758" w:type="dxa"/>
           </w:tcPr>
           <w:p>
             <w:pPr>
@@ -13498,13 +13498,13 @@
                 <w:sz w:val="17"/>
                 <w:szCs w:val="17"/>
               </w:rPr>
-              <w:t xml:space="preserve">2000</w:t>
+              <w:t xml:space="preserve">1000</w:t>
             </w:r>
           </w:p>
         </w:tc>
         <w:tc>
           <w:tcPr>
-            <w:tcW w:w="965" w:type="dxa"/>
+            <w:tcW w:w="968" w:type="dxa"/>
           </w:tcPr>
           <w:p>
             <w:pPr>
@@ -13526,7 +13526,7 @@
         </w:tc>
         <w:tc>
           <w:tcPr>
-            <w:tcW w:w="860" w:type="dxa"/>
+            <w:tcW w:w="863" w:type="dxa"/>
           </w:tcPr>
           <w:p>
             <w:pPr>
@@ -13548,7 +13548,7 @@
         </w:tc>
         <w:tc>
           <w:tcPr>
-            <w:tcW w:w="860" w:type="dxa"/>
+            <w:tcW w:w="863" w:type="dxa"/>
           </w:tcPr>
           <w:p>
             <w:pPr>
@@ -13570,7 +13570,7 @@
         </w:tc>
         <w:tc>
           <w:tcPr>
-            <w:tcW w:w="860" w:type="dxa"/>
+            <w:tcW w:w="863" w:type="dxa"/>
           </w:tcPr>
           <w:p>
             <w:pPr>
@@ -13592,7 +13592,7 @@
         </w:tc>
         <w:tc>
           <w:tcPr>
-            <w:tcW w:w="2956" w:type="dxa"/>
+            <w:tcW w:w="3029" w:type="dxa"/>
           </w:tcPr>
           <w:p>
             <w:pPr>
@@ -13616,7 +13616,7 @@
       <w:tr>
         <w:tc>
           <w:tcPr>
-            <w:tcW w:w="755" w:type="dxa"/>
+            <w:tcW w:w="758" w:type="dxa"/>
           </w:tcPr>
           <w:p>
             <w:pPr>
@@ -13638,7 +13638,7 @@
         </w:tc>
         <w:tc>
           <w:tcPr>
-            <w:tcW w:w="1385" w:type="dxa"/>
+            <w:tcW w:w="1388" w:type="dxa"/>
           </w:tcPr>
           <w:p>
             <w:pPr>
@@ -13660,7 +13660,7 @@
         </w:tc>
         <w:tc>
           <w:tcPr>
-            <w:tcW w:w="965" w:type="dxa"/>
+            <w:tcW w:w="976" w:type="dxa"/>
           </w:tcPr>
           <w:p>
             <w:pPr>
@@ -13682,7 +13682,7 @@
         </w:tc>
         <w:tc>
           <w:tcPr>
-            <w:tcW w:w="860" w:type="dxa"/>
+            <w:tcW w:w="758" w:type="dxa"/>
           </w:tcPr>
           <w:p>
             <w:pPr>
@@ -13698,13 +13698,13 @@
                 <w:sz w:val="17"/>
                 <w:szCs w:val="17"/>
               </w:rPr>
-              <w:t xml:space="preserve">4000</w:t>
+              <w:t xml:space="preserve">3000</w:t>
             </w:r>
           </w:p>
         </w:tc>
         <w:tc>
           <w:tcPr>
-            <w:tcW w:w="965" w:type="dxa"/>
+            <w:tcW w:w="968" w:type="dxa"/>
           </w:tcPr>
           <w:p>
             <w:pPr>
@@ -13726,7 +13726,7 @@
         </w:tc>
         <w:tc>
           <w:tcPr>
-            <w:tcW w:w="860" w:type="dxa"/>
+            <w:tcW w:w="863" w:type="dxa"/>
           </w:tcPr>
           <w:p>
             <w:pPr>
@@ -13748,7 +13748,7 @@
         </w:tc>
         <w:tc>
           <w:tcPr>
-            <w:tcW w:w="860" w:type="dxa"/>
+            <w:tcW w:w="863" w:type="dxa"/>
           </w:tcPr>
           <w:p>
             <w:pPr>
@@ -13770,7 +13770,7 @@
         </w:tc>
         <w:tc>
           <w:tcPr>
-            <w:tcW w:w="860" w:type="dxa"/>
+            <w:tcW w:w="863" w:type="dxa"/>
           </w:tcPr>
           <w:p>
             <w:pPr>
@@ -13792,7 +13792,7 @@
         </w:tc>
         <w:tc>
           <w:tcPr>
-            <w:tcW w:w="2956" w:type="dxa"/>
+            <w:tcW w:w="3029" w:type="dxa"/>
           </w:tcPr>
           <w:p>
             <w:pPr>
@@ -13816,7 +13816,7 @@
       <w:tr>
         <w:tc>
           <w:tcPr>
-            <w:tcW w:w="755" w:type="dxa"/>
+            <w:tcW w:w="758" w:type="dxa"/>
           </w:tcPr>
           <w:p>
             <w:pPr>
@@ -13838,7 +13838,7 @@
         </w:tc>
         <w:tc>
           <w:tcPr>
-            <w:tcW w:w="1385" w:type="dxa"/>
+            <w:tcW w:w="1388" w:type="dxa"/>
           </w:tcPr>
           <w:p>
             <w:pPr>
@@ -13860,7 +13860,7 @@
         </w:tc>
         <w:tc>
           <w:tcPr>
-            <w:tcW w:w="965" w:type="dxa"/>
+            <w:tcW w:w="976" w:type="dxa"/>
           </w:tcPr>
           <w:p>
             <w:pPr>
@@ -13882,7 +13882,7 @@
         </w:tc>
         <w:tc>
           <w:tcPr>
-            <w:tcW w:w="860" w:type="dxa"/>
+            <w:tcW w:w="758" w:type="dxa"/>
           </w:tcPr>
           <w:p>
             <w:pPr>
@@ -13898,13 +13898,13 @@
                 <w:sz w:val="17"/>
                 <w:szCs w:val="17"/>
               </w:rPr>
-              <w:t xml:space="preserve">6000</w:t>
+              <w:t xml:space="preserve">5000</w:t>
             </w:r>
           </w:p>
         </w:tc>
         <w:tc>
           <w:tcPr>
-            <w:tcW w:w="965" w:type="dxa"/>
+            <w:tcW w:w="968" w:type="dxa"/>
           </w:tcPr>
           <w:p>
             <w:pPr>
@@ -13926,7 +13926,7 @@
         </w:tc>
         <w:tc>
           <w:tcPr>
-            <w:tcW w:w="860" w:type="dxa"/>
+            <w:tcW w:w="863" w:type="dxa"/>
           </w:tcPr>
           <w:p>
             <w:pPr>
@@ -13948,7 +13948,7 @@
         </w:tc>
         <w:tc>
           <w:tcPr>
-            <w:tcW w:w="860" w:type="dxa"/>
+            <w:tcW w:w="863" w:type="dxa"/>
           </w:tcPr>
           <w:p>
             <w:pPr>
@@ -13970,7 +13970,7 @@
         </w:tc>
         <w:tc>
           <w:tcPr>
-            <w:tcW w:w="860" w:type="dxa"/>
+            <w:tcW w:w="863" w:type="dxa"/>
           </w:tcPr>
           <w:p>
             <w:pPr>
@@ -13992,7 +13992,7 @@
         </w:tc>
         <w:tc>
           <w:tcPr>
-            <w:tcW w:w="2956" w:type="dxa"/>
+            <w:tcW w:w="3029" w:type="dxa"/>
           </w:tcPr>
           <w:p>
             <w:pPr>
@@ -14016,7 +14016,7 @@
       <w:tr>
         <w:tc>
           <w:tcPr>
-            <w:tcW w:w="755" w:type="dxa"/>
+            <w:tcW w:w="758" w:type="dxa"/>
           </w:tcPr>
           <w:p>
             <w:pPr>
@@ -14038,7 +14038,7 @@
         </w:tc>
         <w:tc>
           <w:tcPr>
-            <w:tcW w:w="1385" w:type="dxa"/>
+            <w:tcW w:w="1388" w:type="dxa"/>
           </w:tcPr>
           <w:p>
             <w:pPr>
@@ -14060,7 +14060,7 @@
         </w:tc>
         <w:tc>
           <w:tcPr>
-            <w:tcW w:w="965" w:type="dxa"/>
+            <w:tcW w:w="976" w:type="dxa"/>
           </w:tcPr>
           <w:p>
             <w:pPr>
@@ -14082,7 +14082,7 @@
         </w:tc>
         <w:tc>
           <w:tcPr>
-            <w:tcW w:w="860" w:type="dxa"/>
+            <w:tcW w:w="758" w:type="dxa"/>
           </w:tcPr>
           <w:p>
             <w:pPr>
@@ -14098,13 +14098,13 @@
                 <w:sz w:val="17"/>
                 <w:szCs w:val="17"/>
               </w:rPr>
-              <w:t xml:space="preserve">10000</w:t>
+              <w:t xml:space="preserve">8000</w:t>
             </w:r>
           </w:p>
         </w:tc>
         <w:tc>
           <w:tcPr>
-            <w:tcW w:w="965" w:type="dxa"/>
+            <w:tcW w:w="968" w:type="dxa"/>
           </w:tcPr>
           <w:p>
             <w:pPr>
@@ -14126,7 +14126,7 @@
         </w:tc>
         <w:tc>
           <w:tcPr>
-            <w:tcW w:w="860" w:type="dxa"/>
+            <w:tcW w:w="863" w:type="dxa"/>
           </w:tcPr>
           <w:p>
             <w:pPr>
@@ -14148,7 +14148,7 @@
         </w:tc>
         <w:tc>
           <w:tcPr>
-            <w:tcW w:w="860" w:type="dxa"/>
+            <w:tcW w:w="863" w:type="dxa"/>
           </w:tcPr>
           <w:p>
             <w:pPr>
@@ -14170,7 +14170,7 @@
         </w:tc>
         <w:tc>
           <w:tcPr>
-            <w:tcW w:w="860" w:type="dxa"/>
+            <w:tcW w:w="863" w:type="dxa"/>
           </w:tcPr>
           <w:p>
             <w:pPr>
@@ -14192,7 +14192,7 @@
         </w:tc>
         <w:tc>
           <w:tcPr>
-            <w:tcW w:w="2956" w:type="dxa"/>
+            <w:tcW w:w="3029" w:type="dxa"/>
           </w:tcPr>
           <w:p>
             <w:pPr>
@@ -15449,12 +15449,12 @@
         <w:tblLook w:val="04A0" w:firstRow="1" w:lastRow="0" w:firstColumn="1" w:lastColumn="0" w:noHBand="0" w:noVBand="1"/>
       </w:tblPr>
       <w:tblGrid>
-        <w:gridCol w:w="1784"/>
-        <w:gridCol w:w="1679"/>
-        <w:gridCol w:w="944"/>
-        <w:gridCol w:w="1033"/>
-        <w:gridCol w:w="2489"/>
-        <w:gridCol w:w="2537"/>
+        <w:gridCol w:w="1783"/>
+        <w:gridCol w:w="1678"/>
+        <w:gridCol w:w="943"/>
+        <w:gridCol w:w="1028"/>
+        <w:gridCol w:w="2465"/>
+        <w:gridCol w:w="2569"/>
       </w:tblGrid>
       <w:tr>
         <w:trPr>
@@ -15462,7 +15462,7 @@
         </w:trPr>
         <w:tc>
           <w:tcPr>
-            <w:tcW w:w="1784" w:type="dxa"/>
+            <w:tcW w:w="1783" w:type="dxa"/>
           </w:tcPr>
           <w:p>
             <w:pPr>
@@ -15486,7 +15486,7 @@
         </w:tc>
         <w:tc>
           <w:tcPr>
-            <w:tcW w:w="1679" w:type="dxa"/>
+            <w:tcW w:w="1678" w:type="dxa"/>
           </w:tcPr>
           <w:p>
             <w:pPr>
@@ -15510,7 +15510,7 @@
         </w:tc>
         <w:tc>
           <w:tcPr>
-            <w:tcW w:w="944" w:type="dxa"/>
+            <w:tcW w:w="943" w:type="dxa"/>
           </w:tcPr>
           <w:p>
             <w:pPr>
@@ -15534,7 +15534,7 @@
         </w:tc>
         <w:tc>
           <w:tcPr>
-            <w:tcW w:w="1033" w:type="dxa"/>
+            <w:tcW w:w="1028" w:type="dxa"/>
           </w:tcPr>
           <w:p>
             <w:pPr>
@@ -15558,7 +15558,7 @@
         </w:tc>
         <w:tc>
           <w:tcPr>
-            <w:tcW w:w="2489" w:type="dxa"/>
+            <w:tcW w:w="2465" w:type="dxa"/>
           </w:tcPr>
           <w:p>
             <w:pPr>
@@ -15582,7 +15582,7 @@
         </w:tc>
         <w:tc>
           <w:tcPr>
-            <w:tcW w:w="2537" w:type="dxa"/>
+            <w:tcW w:w="2569" w:type="dxa"/>
           </w:tcPr>
           <w:p>
             <w:pPr>
@@ -15608,7 +15608,7 @@
       <w:tr>
         <w:tc>
           <w:tcPr>
-            <w:tcW w:w="1784" w:type="dxa"/>
+            <w:tcW w:w="1783" w:type="dxa"/>
           </w:tcPr>
           <w:p>
             <w:pPr>
@@ -15630,7 +15630,7 @@
         </w:tc>
         <w:tc>
           <w:tcPr>
-            <w:tcW w:w="1679" w:type="dxa"/>
+            <w:tcW w:w="1678" w:type="dxa"/>
           </w:tcPr>
           <w:p>
             <w:pPr>
@@ -15652,7 +15652,7 @@
         </w:tc>
         <w:tc>
           <w:tcPr>
-            <w:tcW w:w="944" w:type="dxa"/>
+            <w:tcW w:w="943" w:type="dxa"/>
           </w:tcPr>
           <w:p>
             <w:pPr>
@@ -15674,7 +15674,7 @@
         </w:tc>
         <w:tc>
           <w:tcPr>
-            <w:tcW w:w="1033" w:type="dxa"/>
+            <w:tcW w:w="1028" w:type="dxa"/>
           </w:tcPr>
           <w:p>
             <w:pPr>
@@ -15696,7 +15696,7 @@
         </w:tc>
         <w:tc>
           <w:tcPr>
-            <w:tcW w:w="2489" w:type="dxa"/>
+            <w:tcW w:w="2465" w:type="dxa"/>
           </w:tcPr>
           <w:p>
             <w:pPr>
@@ -15718,7 +15718,7 @@
         </w:tc>
         <w:tc>
           <w:tcPr>
-            <w:tcW w:w="2537" w:type="dxa"/>
+            <w:tcW w:w="2569" w:type="dxa"/>
           </w:tcPr>
           <w:p>
             <w:pPr>
@@ -15742,7 +15742,7 @@
       <w:tr>
         <w:tc>
           <w:tcPr>
-            <w:tcW w:w="1784" w:type="dxa"/>
+            <w:tcW w:w="1783" w:type="dxa"/>
           </w:tcPr>
           <w:p>
             <w:pPr>
@@ -15764,7 +15764,7 @@
         </w:tc>
         <w:tc>
           <w:tcPr>
-            <w:tcW w:w="1679" w:type="dxa"/>
+            <w:tcW w:w="1678" w:type="dxa"/>
           </w:tcPr>
           <w:p>
             <w:pPr>
@@ -15786,7 +15786,7 @@
         </w:tc>
         <w:tc>
           <w:tcPr>
-            <w:tcW w:w="944" w:type="dxa"/>
+            <w:tcW w:w="943" w:type="dxa"/>
           </w:tcPr>
           <w:p>
             <w:pPr>
@@ -15808,7 +15808,7 @@
         </w:tc>
         <w:tc>
           <w:tcPr>
-            <w:tcW w:w="1033" w:type="dxa"/>
+            <w:tcW w:w="1028" w:type="dxa"/>
           </w:tcPr>
           <w:p>
             <w:pPr>
@@ -15830,7 +15830,7 @@
         </w:tc>
         <w:tc>
           <w:tcPr>
-            <w:tcW w:w="2489" w:type="dxa"/>
+            <w:tcW w:w="2465" w:type="dxa"/>
           </w:tcPr>
           <w:p>
             <w:pPr>
@@ -15852,7 +15852,7 @@
         </w:tc>
         <w:tc>
           <w:tcPr>
-            <w:tcW w:w="2537" w:type="dxa"/>
+            <w:tcW w:w="2569" w:type="dxa"/>
           </w:tcPr>
           <w:p>
             <w:pPr>
@@ -15876,7 +15876,7 @@
       <w:tr>
         <w:tc>
           <w:tcPr>
-            <w:tcW w:w="1784" w:type="dxa"/>
+            <w:tcW w:w="1783" w:type="dxa"/>
           </w:tcPr>
           <w:p>
             <w:pPr>
@@ -15898,7 +15898,7 @@
         </w:tc>
         <w:tc>
           <w:tcPr>
-            <w:tcW w:w="1679" w:type="dxa"/>
+            <w:tcW w:w="1678" w:type="dxa"/>
           </w:tcPr>
           <w:p>
             <w:pPr>
@@ -15920,7 +15920,7 @@
         </w:tc>
         <w:tc>
           <w:tcPr>
-            <w:tcW w:w="944" w:type="dxa"/>
+            <w:tcW w:w="943" w:type="dxa"/>
           </w:tcPr>
           <w:p>
             <w:pPr>
@@ -15936,13 +15936,13 @@
                 <w:sz w:val="17"/>
                 <w:szCs w:val="17"/>
               </w:rPr>
-              <w:t xml:space="preserve">100</w:t>
+              <w:t xml:space="preserve">200</w:t>
             </w:r>
           </w:p>
         </w:tc>
         <w:tc>
           <w:tcPr>
-            <w:tcW w:w="1033" w:type="dxa"/>
+            <w:tcW w:w="1028" w:type="dxa"/>
           </w:tcPr>
           <w:p>
             <w:pPr>
@@ -15964,7 +15964,7 @@
         </w:tc>
         <w:tc>
           <w:tcPr>
-            <w:tcW w:w="2489" w:type="dxa"/>
+            <w:tcW w:w="2465" w:type="dxa"/>
           </w:tcPr>
           <w:p>
             <w:pPr>
@@ -15986,7 +15986,7 @@
         </w:tc>
         <w:tc>
           <w:tcPr>
-            <w:tcW w:w="2537" w:type="dxa"/>
+            <w:tcW w:w="2569" w:type="dxa"/>
           </w:tcPr>
           <w:p>
             <w:pPr>
@@ -16010,7 +16010,7 @@
       <w:tr>
         <w:tc>
           <w:tcPr>
-            <w:tcW w:w="1784" w:type="dxa"/>
+            <w:tcW w:w="1783" w:type="dxa"/>
           </w:tcPr>
           <w:p>
             <w:pPr>
@@ -16032,7 +16032,7 @@
         </w:tc>
         <w:tc>
           <w:tcPr>
-            <w:tcW w:w="1679" w:type="dxa"/>
+            <w:tcW w:w="1678" w:type="dxa"/>
           </w:tcPr>
           <w:p>
             <w:pPr>
@@ -16054,7 +16054,7 @@
         </w:tc>
         <w:tc>
           <w:tcPr>
-            <w:tcW w:w="944" w:type="dxa"/>
+            <w:tcW w:w="943" w:type="dxa"/>
           </w:tcPr>
           <w:p>
             <w:pPr>
@@ -16070,13 +16070,13 @@
                 <w:sz w:val="17"/>
                 <w:szCs w:val="17"/>
               </w:rPr>
-              <w:t xml:space="preserve">100</w:t>
+              <w:t xml:space="preserve">200</w:t>
             </w:r>
           </w:p>
         </w:tc>
         <w:tc>
           <w:tcPr>
-            <w:tcW w:w="1033" w:type="dxa"/>
+            <w:tcW w:w="1028" w:type="dxa"/>
           </w:tcPr>
           <w:p>
             <w:pPr>
@@ -16098,7 +16098,7 @@
         </w:tc>
         <w:tc>
           <w:tcPr>
-            <w:tcW w:w="2489" w:type="dxa"/>
+            <w:tcW w:w="2465" w:type="dxa"/>
           </w:tcPr>
           <w:p>
             <w:pPr>
@@ -16120,7 +16120,7 @@
         </w:tc>
         <w:tc>
           <w:tcPr>
-            <w:tcW w:w="2537" w:type="dxa"/>
+            <w:tcW w:w="2569" w:type="dxa"/>
           </w:tcPr>
           <w:p>
             <w:pPr>
@@ -16182,7 +16182,7 @@
       <w:tr>
         <w:tc>
           <w:tcPr>
-            <w:tcW w:w="1784" w:type="dxa"/>
+            <w:tcW w:w="1783" w:type="dxa"/>
           </w:tcPr>
           <w:p>
             <w:pPr>
@@ -16204,7 +16204,7 @@
         </w:tc>
         <w:tc>
           <w:tcPr>
-            <w:tcW w:w="1679" w:type="dxa"/>
+            <w:tcW w:w="1678" w:type="dxa"/>
           </w:tcPr>
           <w:p>
             <w:pPr>
@@ -16226,7 +16226,7 @@
         </w:tc>
         <w:tc>
           <w:tcPr>
-            <w:tcW w:w="944" w:type="dxa"/>
+            <w:tcW w:w="943" w:type="dxa"/>
           </w:tcPr>
           <w:p>
             <w:pPr>
@@ -16242,13 +16242,13 @@
                 <w:sz w:val="17"/>
                 <w:szCs w:val="17"/>
               </w:rPr>
-              <w:t xml:space="preserve">100</w:t>
+              <w:t xml:space="preserve">200</w:t>
             </w:r>
           </w:p>
         </w:tc>
         <w:tc>
           <w:tcPr>
-            <w:tcW w:w="1033" w:type="dxa"/>
+            <w:tcW w:w="1028" w:type="dxa"/>
           </w:tcPr>
           <w:p>
             <w:pPr>
@@ -16270,7 +16270,7 @@
         </w:tc>
         <w:tc>
           <w:tcPr>
-            <w:tcW w:w="2489" w:type="dxa"/>
+            <w:tcW w:w="2465" w:type="dxa"/>
           </w:tcPr>
           <w:p>
             <w:pPr>
@@ -16292,7 +16292,7 @@
         </w:tc>
         <w:tc>
           <w:tcPr>
-            <w:tcW w:w="2537" w:type="dxa"/>
+            <w:tcW w:w="2569" w:type="dxa"/>
           </w:tcPr>
           <w:p>
             <w:pPr>
@@ -16316,7 +16316,7 @@
       <w:tr>
         <w:tc>
           <w:tcPr>
-            <w:tcW w:w="1784" w:type="dxa"/>
+            <w:tcW w:w="1783" w:type="dxa"/>
           </w:tcPr>
           <w:p>
             <w:pPr>
@@ -16338,7 +16338,7 @@
         </w:tc>
         <w:tc>
           <w:tcPr>
-            <w:tcW w:w="1679" w:type="dxa"/>
+            <w:tcW w:w="1678" w:type="dxa"/>
           </w:tcPr>
           <w:p>
             <w:pPr>
@@ -16360,7 +16360,7 @@
         </w:tc>
         <w:tc>
           <w:tcPr>
-            <w:tcW w:w="944" w:type="dxa"/>
+            <w:tcW w:w="943" w:type="dxa"/>
           </w:tcPr>
           <w:p>
             <w:pPr>
@@ -16376,13 +16376,13 @@
                 <w:sz w:val="17"/>
                 <w:szCs w:val="17"/>
               </w:rPr>
-              <w:t xml:space="preserve">100</w:t>
+              <w:t xml:space="preserve">200</w:t>
             </w:r>
           </w:p>
         </w:tc>
         <w:tc>
           <w:tcPr>
-            <w:tcW w:w="1033" w:type="dxa"/>
+            <w:tcW w:w="1028" w:type="dxa"/>
           </w:tcPr>
           <w:p>
             <w:pPr>
@@ -16404,7 +16404,7 @@
         </w:tc>
         <w:tc>
           <w:tcPr>
-            <w:tcW w:w="2489" w:type="dxa"/>
+            <w:tcW w:w="2465" w:type="dxa"/>
           </w:tcPr>
           <w:p>
             <w:pPr>
@@ -16426,7 +16426,7 @@
         </w:tc>
         <w:tc>
           <w:tcPr>
-            <w:tcW w:w="2537" w:type="dxa"/>
+            <w:tcW w:w="2569" w:type="dxa"/>
           </w:tcPr>
           <w:p>
             <w:pPr>
@@ -16450,7 +16450,7 @@
       <w:tr>
         <w:tc>
           <w:tcPr>
-            <w:tcW w:w="1784" w:type="dxa"/>
+            <w:tcW w:w="1783" w:type="dxa"/>
           </w:tcPr>
           <w:p>
             <w:pPr>
@@ -16472,7 +16472,7 @@
         </w:tc>
         <w:tc>
           <w:tcPr>
-            <w:tcW w:w="1679" w:type="dxa"/>
+            <w:tcW w:w="1678" w:type="dxa"/>
           </w:tcPr>
           <w:p>
             <w:pPr>
@@ -16494,7 +16494,7 @@
         </w:tc>
         <w:tc>
           <w:tcPr>
-            <w:tcW w:w="944" w:type="dxa"/>
+            <w:tcW w:w="943" w:type="dxa"/>
           </w:tcPr>
           <w:p>
             <w:pPr>
@@ -16516,7 +16516,7 @@
         </w:tc>
         <w:tc>
           <w:tcPr>
-            <w:tcW w:w="1033" w:type="dxa"/>
+            <w:tcW w:w="1028" w:type="dxa"/>
           </w:tcPr>
           <w:p>
             <w:pPr>
@@ -16538,7 +16538,7 @@
         </w:tc>
         <w:tc>
           <w:tcPr>
-            <w:tcW w:w="2489" w:type="dxa"/>
+            <w:tcW w:w="2465" w:type="dxa"/>
           </w:tcPr>
           <w:p>
             <w:pPr>
@@ -16560,7 +16560,7 @@
         </w:tc>
         <w:tc>
           <w:tcPr>
-            <w:tcW w:w="2537" w:type="dxa"/>
+            <w:tcW w:w="2569" w:type="dxa"/>
           </w:tcPr>
           <w:p>
             <w:pPr>
@@ -16584,7 +16584,7 @@
       <w:tr>
         <w:tc>
           <w:tcPr>
-            <w:tcW w:w="1784" w:type="dxa"/>
+            <w:tcW w:w="1783" w:type="dxa"/>
           </w:tcPr>
           <w:p>
             <w:pPr>
@@ -16606,7 +16606,7 @@
         </w:tc>
         <w:tc>
           <w:tcPr>
-            <w:tcW w:w="1679" w:type="dxa"/>
+            <w:tcW w:w="1678" w:type="dxa"/>
           </w:tcPr>
           <w:p>
             <w:pPr>
@@ -16628,7 +16628,7 @@
         </w:tc>
         <w:tc>
           <w:tcPr>
-            <w:tcW w:w="944" w:type="dxa"/>
+            <w:tcW w:w="943" w:type="dxa"/>
           </w:tcPr>
           <w:p>
             <w:pPr>
@@ -16644,13 +16644,13 @@
                 <w:sz w:val="17"/>
                 <w:szCs w:val="17"/>
               </w:rPr>
-              <w:t xml:space="preserve">200</w:t>
+              <w:t xml:space="preserve">300</w:t>
             </w:r>
           </w:p>
         </w:tc>
         <w:tc>
           <w:tcPr>
-            <w:tcW w:w="1033" w:type="dxa"/>
+            <w:tcW w:w="1028" w:type="dxa"/>
           </w:tcPr>
           <w:p>
             <w:pPr>
@@ -16672,7 +16672,7 @@
         </w:tc>
         <w:tc>
           <w:tcPr>
-            <w:tcW w:w="2489" w:type="dxa"/>
+            <w:tcW w:w="2465" w:type="dxa"/>
           </w:tcPr>
           <w:p>
             <w:pPr>
@@ -16694,7 +16694,7 @@
         </w:tc>
         <w:tc>
           <w:tcPr>
-            <w:tcW w:w="2537" w:type="dxa"/>
+            <w:tcW w:w="2569" w:type="dxa"/>
           </w:tcPr>
           <w:p>
             <w:pPr>
@@ -16710,7 +16710,7 @@
                 <w:sz w:val="17"/>
                 <w:szCs w:val="17"/>
               </w:rPr>
-              <w:t xml:space="preserve">Local Armies form (10/15/25 by Settlement size). All Garrisons share Equipment. Cannot be targeted; may Sally Forth.</w:t>
+              <w:t xml:space="preserve">Local Armies form (10/15/25/50 by Settlement size). All Garrisons share Equipment. Cannot be targeted; may Sally Forth.</w:t>
             </w:r>
           </w:p>
         </w:tc>
@@ -16718,7 +16718,7 @@
       <w:tr>
         <w:tc>
           <w:tcPr>
-            <w:tcW w:w="1784" w:type="dxa"/>
+            <w:tcW w:w="1783" w:type="dxa"/>
           </w:tcPr>
           <w:p>
             <w:pPr>
@@ -16740,7 +16740,7 @@
         </w:tc>
         <w:tc>
           <w:tcPr>
-            <w:tcW w:w="1679" w:type="dxa"/>
+            <w:tcW w:w="1678" w:type="dxa"/>
           </w:tcPr>
           <w:p>
             <w:pPr>
@@ -16762,7 +16762,7 @@
         </w:tc>
         <w:tc>
           <w:tcPr>
-            <w:tcW w:w="944" w:type="dxa"/>
+            <w:tcW w:w="943" w:type="dxa"/>
           </w:tcPr>
           <w:p>
             <w:pPr>
@@ -16778,13 +16778,13 @@
                 <w:sz w:val="17"/>
                 <w:szCs w:val="17"/>
               </w:rPr>
-              <w:t xml:space="preserve">100</w:t>
+              <w:t xml:space="preserve">200</w:t>
             </w:r>
           </w:p>
         </w:tc>
         <w:tc>
           <w:tcPr>
-            <w:tcW w:w="1033" w:type="dxa"/>
+            <w:tcW w:w="1028" w:type="dxa"/>
           </w:tcPr>
           <w:p>
             <w:pPr>
@@ -16806,7 +16806,7 @@
         </w:tc>
         <w:tc>
           <w:tcPr>
-            <w:tcW w:w="2489" w:type="dxa"/>
+            <w:tcW w:w="2465" w:type="dxa"/>
           </w:tcPr>
           <w:p>
             <w:pPr>
@@ -16828,7 +16828,7 @@
         </w:tc>
         <w:tc>
           <w:tcPr>
-            <w:tcW w:w="2537" w:type="dxa"/>
+            <w:tcW w:w="2569" w:type="dxa"/>
           </w:tcPr>
           <w:p>
             <w:pPr>
@@ -16890,7 +16890,7 @@
       <w:tr>
         <w:tc>
           <w:tcPr>
-            <w:tcW w:w="1784" w:type="dxa"/>
+            <w:tcW w:w="1783" w:type="dxa"/>
           </w:tcPr>
           <w:p>
             <w:pPr>
@@ -16912,7 +16912,7 @@
         </w:tc>
         <w:tc>
           <w:tcPr>
-            <w:tcW w:w="1679" w:type="dxa"/>
+            <w:tcW w:w="1678" w:type="dxa"/>
           </w:tcPr>
           <w:p>
             <w:pPr>
@@ -16934,7 +16934,7 @@
         </w:tc>
         <w:tc>
           <w:tcPr>
-            <w:tcW w:w="944" w:type="dxa"/>
+            <w:tcW w:w="943" w:type="dxa"/>
           </w:tcPr>
           <w:p>
             <w:pPr>
@@ -16950,13 +16950,13 @@
                 <w:sz w:val="17"/>
                 <w:szCs w:val="17"/>
               </w:rPr>
-              <w:t xml:space="preserve">100</w:t>
+              <w:t xml:space="preserve">200</w:t>
             </w:r>
           </w:p>
         </w:tc>
         <w:tc>
           <w:tcPr>
-            <w:tcW w:w="1033" w:type="dxa"/>
+            <w:tcW w:w="1028" w:type="dxa"/>
           </w:tcPr>
           <w:p>
             <w:pPr>
@@ -16978,7 +16978,7 @@
         </w:tc>
         <w:tc>
           <w:tcPr>
-            <w:tcW w:w="2489" w:type="dxa"/>
+            <w:tcW w:w="2465" w:type="dxa"/>
           </w:tcPr>
           <w:p>
             <w:pPr>
@@ -17000,7 +17000,7 @@
         </w:tc>
         <w:tc>
           <w:tcPr>
-            <w:tcW w:w="2537" w:type="dxa"/>
+            <w:tcW w:w="2569" w:type="dxa"/>
           </w:tcPr>
           <w:p>
             <w:pPr>
@@ -17024,7 +17024,7 @@
       <w:tr>
         <w:tc>
           <w:tcPr>
-            <w:tcW w:w="1784" w:type="dxa"/>
+            <w:tcW w:w="1783" w:type="dxa"/>
           </w:tcPr>
           <w:p>
             <w:pPr>
@@ -17046,7 +17046,7 @@
         </w:tc>
         <w:tc>
           <w:tcPr>
-            <w:tcW w:w="1679" w:type="dxa"/>
+            <w:tcW w:w="1678" w:type="dxa"/>
           </w:tcPr>
           <w:p>
             <w:pPr>
@@ -17068,7 +17068,7 @@
         </w:tc>
         <w:tc>
           <w:tcPr>
-            <w:tcW w:w="944" w:type="dxa"/>
+            <w:tcW w:w="943" w:type="dxa"/>
           </w:tcPr>
           <w:p>
             <w:pPr>
@@ -17084,13 +17084,13 @@
                 <w:sz w:val="17"/>
                 <w:szCs w:val="17"/>
               </w:rPr>
-              <w:t xml:space="preserve">100</w:t>
+              <w:t xml:space="preserve">300</w:t>
             </w:r>
           </w:p>
         </w:tc>
         <w:tc>
           <w:tcPr>
-            <w:tcW w:w="1033" w:type="dxa"/>
+            <w:tcW w:w="1028" w:type="dxa"/>
           </w:tcPr>
           <w:p>
             <w:pPr>
@@ -17112,7 +17112,7 @@
         </w:tc>
         <w:tc>
           <w:tcPr>
-            <w:tcW w:w="2489" w:type="dxa"/>
+            <w:tcW w:w="2465" w:type="dxa"/>
           </w:tcPr>
           <w:p>
             <w:pPr>
@@ -17134,7 +17134,7 @@
         </w:tc>
         <w:tc>
           <w:tcPr>
-            <w:tcW w:w="2537" w:type="dxa"/>
+            <w:tcW w:w="2569" w:type="dxa"/>
           </w:tcPr>
           <w:p>
             <w:pPr>
@@ -17150,7 +17150,7 @@
                 <w:sz w:val="17"/>
                 <w:szCs w:val="17"/>
               </w:rPr>
-              <w:t xml:space="preserve">Faith +1</w:t>
+              <w:t xml:space="preserve">Faith +2</w:t>
             </w:r>
           </w:p>
         </w:tc>
@@ -17158,7 +17158,7 @@
       <w:tr>
         <w:tc>
           <w:tcPr>
-            <w:tcW w:w="1784" w:type="dxa"/>
+            <w:tcW w:w="1783" w:type="dxa"/>
           </w:tcPr>
           <w:p>
             <w:pPr>
@@ -17180,7 +17180,7 @@
         </w:tc>
         <w:tc>
           <w:tcPr>
-            <w:tcW w:w="1679" w:type="dxa"/>
+            <w:tcW w:w="1678" w:type="dxa"/>
           </w:tcPr>
           <w:p>
             <w:pPr>
@@ -17202,7 +17202,7 @@
         </w:tc>
         <w:tc>
           <w:tcPr>
-            <w:tcW w:w="944" w:type="dxa"/>
+            <w:tcW w:w="943" w:type="dxa"/>
           </w:tcPr>
           <w:p>
             <w:pPr>
@@ -17218,13 +17218,13 @@
                 <w:sz w:val="17"/>
                 <w:szCs w:val="17"/>
               </w:rPr>
-              <w:t xml:space="preserve">200</w:t>
+              <w:t xml:space="preserve">300</w:t>
             </w:r>
           </w:p>
         </w:tc>
         <w:tc>
           <w:tcPr>
-            <w:tcW w:w="1033" w:type="dxa"/>
+            <w:tcW w:w="1028" w:type="dxa"/>
           </w:tcPr>
           <w:p>
             <w:pPr>
@@ -17246,7 +17246,7 @@
         </w:tc>
         <w:tc>
           <w:tcPr>
-            <w:tcW w:w="2489" w:type="dxa"/>
+            <w:tcW w:w="2465" w:type="dxa"/>
           </w:tcPr>
           <w:p>
             <w:pPr>
@@ -17268,7 +17268,7 @@
         </w:tc>
         <w:tc>
           <w:tcPr>
-            <w:tcW w:w="2537" w:type="dxa"/>
+            <w:tcW w:w="2569" w:type="dxa"/>
           </w:tcPr>
           <w:p>
             <w:pPr>
@@ -19831,7 +19831,7 @@
                 <w:sz w:val="17"/>
                 <w:szCs w:val="17"/>
               </w:rPr>
-              <w:t xml:space="preserve">Speed -1</w:t>
+              <w:t xml:space="preserve">Speed -2</w:t>
             </w:r>
           </w:p>
         </w:tc>

</xml_diff>

<commit_message>
v0.4.9.7.1: wiki + reference pages, Mill merge, Cipher Chamber
</commit_message>
<xml_diff>
--- a/Combatv3/Rules.docx
+++ b/Combatv3/Rules.docx
@@ -10526,7 +10526,7 @@
                 <w:sz w:val="17"/>
                 <w:szCs w:val="17"/>
               </w:rPr>
-              <w:t xml:space="preserve">One True Gospel: Each Empire Phase, all other players with a lower Piety value gain Doubt +2. +1 Morale</w:t>
+              <w:t xml:space="preserve">One True Gospel: Each Empire Phase, all other non-allied players with a lower Piety value gain Doubt +2. +1 Morale</w:t>
             </w:r>
           </w:p>
         </w:tc>
@@ -25140,15 +25140,15 @@
           <w:b/>
           <w:i w:val="0"/>
         </w:rPr>
-        <w:t>Settlement</w:t>
-      </w:r>
-      <w:r>
-        <w:rPr>
-          <w:rFonts w:ascii="EB Garamond" w:hAnsi="EB Garamond"/>
-          <w:b w:val="0"/>
-          <w:i w:val="0"/>
-        </w:rPr>
-        <w:t xml:space="preserve">s being besieged: cannot count </w:t>
+        <w:t>Settlements</w:t>
+      </w:r>
+      <w:r>
+        <w:rPr>
+          <w:rFonts w:ascii="EB Garamond" w:hAnsi="EB Garamond"/>
+          <w:b w:val="0"/>
+          <w:i w:val="0"/>
+        </w:rPr>
+        <w:t xml:space="preserve"> being besieged: cannot count </w:t>
       </w:r>
       <w:r>
         <w:rPr>
@@ -25742,7 +25742,7 @@
           <w:b/>
           <w:i w:val="0"/>
         </w:rPr>
-        <w:t>1000</w:t>
+        <w:t>2500</w:t>
       </w:r>
       <w:r>
         <w:rPr>

</xml_diff>

<commit_message>
v0.4.9.7.5: wiki + reference pages, Mill merge, Cipher Chamber
</commit_message>
<xml_diff>
--- a/Combatv3/Rules.docx
+++ b/Combatv3/Rules.docx
@@ -8295,7 +8295,7 @@
           <w:rFonts w:ascii="EB Garamond" w:hAnsi="EB Garamond"/>
           <w:sz w:val="20"/>
         </w:rPr>
-        <w:t xml:space="preserve">Choose another player's closest non-capital settlement; they must have Public Order −5 or lower. Lay Siege using only settlement-type siege modifiers (Wooden Walls, Stone Walls, Citadel, Garrison, Standing Army) and set a Convert Timer. At 0, the settlement joins your empire (see Capture).</w:t>
+        <w:t xml:space="preserve">Choose another player's closest non-capital settlement; they must have Public Order −5 or lower. Lay Siege using only settlement-type siege modifiers (Settlement Size &amp; Citadel) and set a Convert Timer. At 0, the settlement joins your empire (see Capture).</w:t>
       </w:r>
     </w:p>
     <w:p>
@@ -8719,7 +8719,7 @@
           <w:rFonts w:ascii="EB Garamond" w:hAnsi="EB Garamond"/>
           <w:sz w:val="20"/>
         </w:rPr>
-        <w:t xml:space="preserve">2000 gold</w:t>
+        <w:t xml:space="preserve">0 gold</w:t>
       </w:r>
     </w:p>
     <w:p>
@@ -15734,7 +15734,7 @@
                 <w:sz w:val="17"/>
                 <w:szCs w:val="17"/>
               </w:rPr>
-              <w:t xml:space="preserve">Can Trade; place Dirt Road Territories in Province; ignore Terrain Speed Modifiers</w:t>
+              <w:t xml:space="preserve">Can Trade; If you start a Move action within Province, gain Speed +1</w:t>
             </w:r>
           </w:p>
         </w:tc>
@@ -16176,6 +16176,68 @@
               </w:rPr>
               <w:t xml:space="preserve">settlements</w:t>
             </w:r>
+            <w:r>
+              <w:rPr>
+                <w:rFonts w:ascii="EB Garamond" w:hAnsi="EB Garamond" w:cs="EB Garamond"/>
+                <w:sz w:val="17"/>
+                <w:szCs w:val="17"/>
+              </w:rPr>
+              <w:t xml:space="preserve">. </w:t>
+            </w:r>
+            <w:r>
+              <w:rPr>
+                <w:rFonts w:ascii="EB Garamond" w:hAnsi="EB Garamond" w:cs="EB Garamond"/>
+                <w:b/>
+                <w:bCs/>
+                <w:sz w:val="17"/>
+                <w:szCs w:val="17"/>
+              </w:rPr>
+              <w:t xml:space="preserve">Influence -1</w:t>
+            </w:r>
+            <w:r>
+              <w:rPr>
+                <w:rFonts w:ascii="EB Garamond" w:hAnsi="EB Garamond" w:cs="EB Garamond"/>
+                <w:sz w:val="17"/>
+                <w:szCs w:val="17"/>
+              </w:rPr>
+              <w:t xml:space="preserve"> to Bandit </w:t>
+            </w:r>
+            <w:r>
+              <w:rPr>
+                <w:rFonts w:ascii="EB Garamond" w:hAnsi="EB Garamond" w:cs="EB Garamond"/>
+                <w:b/>
+                <w:bCs/>
+                <w:sz w:val="17"/>
+                <w:szCs w:val="17"/>
+              </w:rPr>
+              <w:t xml:space="preserve">Cunning actions</w:t>
+            </w:r>
+            <w:r>
+              <w:rPr>
+                <w:rFonts w:ascii="EB Garamond" w:hAnsi="EB Garamond" w:cs="EB Garamond"/>
+                <w:sz w:val="17"/>
+                <w:szCs w:val="17"/>
+              </w:rPr>
+              <w:t xml:space="preserve"> targetting your </w:t>
+            </w:r>
+            <w:r>
+              <w:rPr>
+                <w:rFonts w:ascii="EB Garamond" w:hAnsi="EB Garamond" w:cs="EB Garamond"/>
+                <w:b/>
+                <w:bCs/>
+                <w:sz w:val="17"/>
+                <w:szCs w:val="17"/>
+              </w:rPr>
+              <w:t xml:space="preserve">settlements</w:t>
+            </w:r>
+            <w:r>
+              <w:rPr>
+                <w:rFonts w:ascii="EB Garamond" w:hAnsi="EB Garamond" w:cs="EB Garamond"/>
+                <w:sz w:val="17"/>
+                <w:szCs w:val="17"/>
+              </w:rPr>
+              <w:t xml:space="preserve">.</w:t>
+            </w:r>
           </w:p>
         </w:tc>
       </w:tr>
@@ -16308,7 +16370,7 @@
                 <w:sz w:val="17"/>
                 <w:szCs w:val="17"/>
               </w:rPr>
-              <w:t xml:space="preserve">Ignore Terrain Speed Modifiers; if you start turn on Stone Road gain Speed +2; replaces Dirt Roads</w:t>
+              <w:t xml:space="preserve">If you start a Move action within Province, gain Speed +2</w:t>
             </w:r>
           </w:p>
         </w:tc>
@@ -16778,7 +16840,7 @@
                 <w:sz w:val="17"/>
                 <w:szCs w:val="17"/>
               </w:rPr>
-              <w:t xml:space="preserve">200</w:t>
+              <w:t xml:space="preserve">300</w:t>
             </w:r>
           </w:p>
         </w:tc>
@@ -16883,6 +16945,68 @@
                 <w:szCs w:val="17"/>
               </w:rPr>
               <w:t xml:space="preserve">settlements</w:t>
+            </w:r>
+            <w:r>
+              <w:rPr>
+                <w:rFonts w:ascii="EB Garamond" w:hAnsi="EB Garamond" w:cs="EB Garamond"/>
+                <w:sz w:val="17"/>
+                <w:szCs w:val="17"/>
+              </w:rPr>
+              <w:t xml:space="preserve">. </w:t>
+            </w:r>
+            <w:r>
+              <w:rPr>
+                <w:rFonts w:ascii="EB Garamond" w:hAnsi="EB Garamond" w:cs="EB Garamond"/>
+                <w:b/>
+                <w:bCs/>
+                <w:sz w:val="17"/>
+                <w:szCs w:val="17"/>
+              </w:rPr>
+              <w:t xml:space="preserve">Influence -1</w:t>
+            </w:r>
+            <w:r>
+              <w:rPr>
+                <w:rFonts w:ascii="EB Garamond" w:hAnsi="EB Garamond" w:cs="EB Garamond"/>
+                <w:sz w:val="17"/>
+                <w:szCs w:val="17"/>
+              </w:rPr>
+              <w:t xml:space="preserve"> to Bandit </w:t>
+            </w:r>
+            <w:r>
+              <w:rPr>
+                <w:rFonts w:ascii="EB Garamond" w:hAnsi="EB Garamond" w:cs="EB Garamond"/>
+                <w:b/>
+                <w:bCs/>
+                <w:sz w:val="17"/>
+                <w:szCs w:val="17"/>
+              </w:rPr>
+              <w:t xml:space="preserve">Cunning actions</w:t>
+            </w:r>
+            <w:r>
+              <w:rPr>
+                <w:rFonts w:ascii="EB Garamond" w:hAnsi="EB Garamond" w:cs="EB Garamond"/>
+                <w:sz w:val="17"/>
+                <w:szCs w:val="17"/>
+              </w:rPr>
+              <w:t xml:space="preserve"> targetting your </w:t>
+            </w:r>
+            <w:r>
+              <w:rPr>
+                <w:rFonts w:ascii="EB Garamond" w:hAnsi="EB Garamond" w:cs="EB Garamond"/>
+                <w:b/>
+                <w:bCs/>
+                <w:sz w:val="17"/>
+                <w:szCs w:val="17"/>
+              </w:rPr>
+              <w:t xml:space="preserve">settlements</w:t>
+            </w:r>
+            <w:r>
+              <w:rPr>
+                <w:rFonts w:ascii="EB Garamond" w:hAnsi="EB Garamond" w:cs="EB Garamond"/>
+                <w:sz w:val="17"/>
+                <w:szCs w:val="17"/>
+              </w:rPr>
+              <w:t xml:space="preserve">.</w:t>
             </w:r>
           </w:p>
         </w:tc>
@@ -16950,7 +17074,7 @@
                 <w:sz w:val="17"/>
                 <w:szCs w:val="17"/>
               </w:rPr>
-              <w:t xml:space="preserve">200</w:t>
+              <w:t xml:space="preserve">300</w:t>
             </w:r>
           </w:p>
         </w:tc>
@@ -26625,7 +26749,7 @@
                 <w:sz w:val="17"/>
                 <w:szCs w:val="17"/>
               </w:rPr>
-              <w:t xml:space="preserve">5</w:t>
+              <w:t xml:space="preserve">3</w:t>
             </w:r>
           </w:p>
         </w:tc>
@@ -26671,7 +26795,7 @@
                 <w:sz w:val="17"/>
                 <w:szCs w:val="17"/>
               </w:rPr>
-              <w:t xml:space="preserve">10</w:t>
+              <w:t xml:space="preserve">4</w:t>
             </w:r>
           </w:p>
         </w:tc>

</xml_diff>

<commit_message>
v0.4.9.7.6: wiki + reference pages, Mill merge, Cipher Chamber
</commit_message>
<xml_diff>
--- a/Combatv3/Rules.docx
+++ b/Combatv3/Rules.docx
@@ -2085,7 +2085,7 @@
           <w:b w:val="0"/>
           <w:i w:val="0"/>
         </w:rPr>
-        <w:t xml:space="preserve"> — the weight you bring to Envoy votes. Base Influence comes from your Standing (0/1/2/3); you may spend up to 1 + Standing to support or oppose.</w:t>
+        <w:t xml:space="preserve"> — the weight you bring to Envoy votes. Base Influence comes from your Standing (1/2/3/4); you may spend up to 1 + Standing to support or oppose.</w:t>
       </w:r>
     </w:p>
     <w:p>
@@ -5169,7 +5169,7 @@
           <w:b/>
           <w:i w:val="0"/>
         </w:rPr>
-        <w:t>Untested 0, Rising 1, Established 2, Sovereign 3</w:t>
+        <w:t>Untested 1, Rising 2, Established 3, Sovereign 4</w:t>
       </w:r>
       <w:r>
         <w:rPr>
@@ -5416,15 +5416,31 @@
           <w:b/>
           <w:i w:val="0"/>
         </w:rPr>
-        <w:t>0</w:t>
-      </w:r>
-      <w:r>
-        <w:rPr>
-          <w:rFonts w:ascii="EB Garamond" w:hAnsi="EB Garamond"/>
-          <w:b w:val="0"/>
-          <w:i w:val="0"/>
-        </w:rPr>
-        <w:t xml:space="preserve">, and you can't support it yourself — so it can only pass if </w:t>
+        <w:t>1</w:t>
+      </w:r>
+      <w:r>
+        <w:rPr>
+          <w:rFonts w:ascii="EB Garamond" w:hAnsi="EB Garamond"/>
+          <w:b w:val="0"/>
+          <w:i w:val="0"/>
+        </w:rPr>
+        <w:t xml:space="preserve">, and you can't support it yourself — so it can easily fail if </w:t>
+      </w:r>
+      <w:r>
+        <w:rPr>
+          <w:rFonts w:ascii="EB Garamond" w:hAnsi="EB Garamond"/>
+          <w:b/>
+          <w:i w:val="0"/>
+        </w:rPr>
+        <w:t>another player chooses to oppose you</w:t>
+      </w:r>
+      <w:r>
+        <w:rPr>
+          <w:rFonts w:ascii="EB Garamond" w:hAnsi="EB Garamond"/>
+          <w:b w:val="0"/>
+          <w:i w:val="0"/>
+        </w:rPr>
+        <w:t xml:space="preserve"> and saved if </w:t>
       </w:r>
       <w:r>
         <w:rPr>
@@ -5440,7 +5456,7 @@
           <w:b w:val="0"/>
           <w:i w:val="0"/>
         </w:rPr>
-        <w:t>. Influence is the currency of those favors. Unless players back each other, envoys fail; deciding whose actions to lift and whose to bury is the core of every turn.</w:t>
+        <w:t>. Influence is the currency of those actions, and are scaled by your standing in that domain. Unless players back each other, envoys can fail from cheap opposition; deciding whose actions to lift and whose to bury is the core of every turn.</w:t>
       </w:r>
     </w:p>
     <w:p>
@@ -11084,7 +11100,7 @@
                 <w:sz w:val="17"/>
                 <w:szCs w:val="17"/>
               </w:rPr>
-              <w:t xml:space="preserve">0</w:t>
+              <w:t xml:space="preserve">1</w:t>
             </w:r>
           </w:p>
         </w:tc>
@@ -11152,7 +11168,7 @@
                 <w:sz w:val="17"/>
                 <w:szCs w:val="17"/>
               </w:rPr>
-              <w:t xml:space="preserve">1</w:t>
+              <w:t xml:space="preserve">2</w:t>
             </w:r>
           </w:p>
         </w:tc>
@@ -11220,7 +11236,7 @@
                 <w:sz w:val="17"/>
                 <w:szCs w:val="17"/>
               </w:rPr>
-              <w:t xml:space="preserve">2</w:t>
+              <w:t xml:space="preserve">3</w:t>
             </w:r>
           </w:p>
         </w:tc>
@@ -11288,7 +11304,7 @@
                 <w:sz w:val="17"/>
                 <w:szCs w:val="17"/>
               </w:rPr>
-              <w:t xml:space="preserve">3</w:t>
+              <w:t xml:space="preserve">4</w:t>
             </w:r>
           </w:p>
         </w:tc>

</xml_diff>